<commit_message>
Prompt 7: Security audit and hardening
</commit_message>
<xml_diff>
--- a/Dashboard Design- Per Portfolio Structure.docx
+++ b/Dashboard Design- Per Portfolio Structure.docx
@@ -5,53 +5,39 @@
     <w:p/>
     <w:p>
       <w:r>
+        <w:t># Dashboard Design: Per Portfolio Structure</w:t>
+      </w:r>
+    </w:p>
+    <w:p/>
+    <w:p>
+      <w:r>
+        <w:t xml:space="preserve">Below is a comprehensive proposal for each of the three structures, </w:t>
+      </w:r>
+      <w:proofErr w:type="spellStart"/>
+      <w:r>
+        <w:t>modeled</w:t>
+      </w:r>
+      <w:proofErr w:type="spellEnd"/>
+      <w:r>
+        <w:t xml:space="preserve"> after the 10-tab upfront-tail dashboard but tailored to the unique economics, risk drivers, and decision variables of each structure.</w:t>
+      </w:r>
+    </w:p>
+    <w:p/>
+    <w:p>
+      <w:r>
         <w:t>---</w:t>
       </w:r>
     </w:p>
     <w:p/>
     <w:p>
       <w:r>
-        <w:t># Dashboard Design: Per Portfolio Structure</w:t>
-      </w:r>
-    </w:p>
-    <w:p/>
-    <w:p>
-      <w:r>
-        <w:t xml:space="preserve">Below is a comprehensive proposal for each of the three structures, </w:t>
-      </w:r>
-      <w:proofErr w:type="spellStart"/>
-      <w:r>
-        <w:t>modeled</w:t>
-      </w:r>
-      <w:proofErr w:type="spellEnd"/>
-      <w:r>
-        <w:t xml:space="preserve"> after the 10-tab upfront-tail dashboard but tailored to the unique economics, risk drivers, and decision variables of each structure.</w:t>
-      </w:r>
-    </w:p>
-    <w:p/>
-    <w:p>
-      <w:r>
-        <w:t>---</w:t>
-      </w:r>
-    </w:p>
-    <w:p/>
-    <w:p>
-      <w:r>
         <w:t>## 1. LITIGATION FUNDING PORTFOLIO</w:t>
       </w:r>
     </w:p>
     <w:p/>
     <w:p>
       <w:r>
-        <w:t xml:space="preserve">&gt; **Core investor </w:t>
-      </w:r>
-      <w:proofErr w:type="gramStart"/>
-      <w:r>
-        <w:t>question:*</w:t>
-      </w:r>
-      <w:proofErr w:type="gramEnd"/>
-      <w:r>
-        <w:t>* "I'm funding legal costs in exchange for a capped share of the award. What cost-multiple and award-ratio caps maximise my risk-adjusted return?"</w:t>
+        <w:t>&gt; **Core investor question:** "I'm funding legal costs in exchange for a capped share of the award. What cost-multiple and award-ratio caps maximise my risk-adjusted return?"</w:t>
       </w:r>
     </w:p>
     <w:p/>
@@ -73,15 +59,7 @@
     </w:p>
     <w:p>
       <w:r>
-        <w:t xml:space="preserve">| 1 | **Funding Economics Overview** | Expandable formula card | Fund Return = </w:t>
-      </w:r>
-      <w:proofErr w:type="gramStart"/>
-      <w:r>
-        <w:t>min(</w:t>
-      </w:r>
-      <w:proofErr w:type="gramEnd"/>
-      <w:r>
-        <w:t>Cost Multiple × Legal Costs, Award Ratio × Collected Award). Shows portfolio-level arithmetic with expansion per claim |</w:t>
+        <w:t>| 1 | **Funding Economics Overview** | Expandable formula card | Fund Return = min(Cost Multiple × Legal Costs, Award Ratio × Collected Award). Shows portfolio-level arithmetic with expansion per claim |</w:t>
       </w:r>
     </w:p>
     <w:p>
@@ -94,15 +72,7 @@
       </w:r>
       <w:proofErr w:type="spellEnd"/>
       <w:r>
-        <w:t xml:space="preserve"> Win Rate, Total </w:t>
-      </w:r>
-      <w:proofErr w:type="gramStart"/>
-      <w:r>
-        <w:t>E[</w:t>
-      </w:r>
-      <w:proofErr w:type="gramEnd"/>
-      <w:r>
-        <w:t>Legal Costs] (= Investment), E[Collected], E[Fund Return], E[Net Profit] |</w:t>
+        <w:t xml:space="preserve"> Win Rate, Total E[Legal Costs] (= Investment), E[Collected], E[Fund Return], E[Net Profit] |</w:t>
       </w:r>
     </w:p>
     <w:p>
@@ -125,68 +95,28 @@
     </w:p>
     <w:p>
       <w:r>
+        <w:t>| 5 | **J-Curve Fan Chart** | Multi-line fan (P10–P90) | Cumulative net cashflow over 96 months. Shows initial legal-cost burn tapering into recovery payouts |</w:t>
+      </w:r>
+    </w:p>
+    <w:p>
+      <w:r>
         <w:lastRenderedPageBreak/>
-        <w:t xml:space="preserve">| 5 | **J-Curve Fan Chart** | </w:t>
-      </w:r>
-      <w:proofErr w:type="gramStart"/>
-      <w:r>
-        <w:t>Multi-line</w:t>
-      </w:r>
-      <w:proofErr w:type="gramEnd"/>
-      <w:r>
-        <w:t xml:space="preserve"> fan (P10–P90) | Cumulative net cashflow over 96 months. Shows initial legal-cost burn tapering into recovery payouts |</w:t>
-      </w:r>
-    </w:p>
-    <w:p>
-      <w:r>
-        <w:t xml:space="preserve">| 6 | **Claim Overview Cards** | Grid of cards | Per-claim: SOC, Win Rate, </w:t>
-      </w:r>
-      <w:proofErr w:type="gramStart"/>
-      <w:r>
-        <w:t>E[</w:t>
-      </w:r>
-      <w:proofErr w:type="gramEnd"/>
-      <w:r>
-        <w:t>Legal Cost], E[Duration], Jurisdiction, viability badge, outcome bar (Win/Restart/Lose %) |</w:t>
-      </w:r>
-    </w:p>
-    <w:p>
-      <w:r>
-        <w:t xml:space="preserve">| 7 | **Return Distribution** | Histogram + dropdowns | MC outcome distribution of portfolio MOIC. Dropdowns: Cost Multiple </w:t>
-      </w:r>
-      <w:proofErr w:type="gramStart"/>
-      <w:r>
-        <w:t>cap</w:t>
-      </w:r>
-      <w:proofErr w:type="gramEnd"/>
-      <w:r>
-        <w:t>, Award Ratio cap |</w:t>
-      </w:r>
-    </w:p>
-    <w:p>
-      <w:r>
-        <w:t xml:space="preserve">| 8 | **Funding Scenario Summary** | HTML table + dropdown | Rows: cost multiples. Columns: Investment (= legal costs), E[MOIC], E[IRR], P(Loss), </w:t>
-      </w:r>
-      <w:proofErr w:type="gramStart"/>
-      <w:r>
-        <w:t>E[</w:t>
-      </w:r>
-      <w:proofErr w:type="gramEnd"/>
-      <w:r>
-        <w:t>Net Return], P(Hurdle). Dropdown for Award Ratio. Color-coded |</w:t>
-      </w:r>
-    </w:p>
-    <w:p>
-      <w:r>
-        <w:t>| 9 | **</w:t>
-      </w:r>
-      <w:proofErr w:type="gramStart"/>
-      <w:r>
-        <w:t>Cross-Claim</w:t>
-      </w:r>
-      <w:proofErr w:type="gramEnd"/>
-      <w:r>
-        <w:t xml:space="preserve"> Comparison: IRR &amp; MOIC** | Dual-axis bar chart | X: Claim ID. Left Y: E[MOIC] (bars). Right Y: E[IRR] (bars). Dropdowns for Cost Multiple and Award Ratio |</w:t>
+        <w:t>| 6 | **Claim Overview Cards** | Grid of cards | Per-claim: SOC, Win Rate, E[Legal Cost], E[Duration], Jurisdiction, viability badge, outcome bar (Win/Restart/Lose %) |</w:t>
+      </w:r>
+    </w:p>
+    <w:p>
+      <w:r>
+        <w:t>| 7 | **Return Distribution** | Histogram + dropdowns | MC outcome distribution of portfolio MOIC. Dropdowns: Cost Multiple cap, Award Ratio cap |</w:t>
+      </w:r>
+    </w:p>
+    <w:p>
+      <w:r>
+        <w:t>| 8 | **Funding Scenario Summary** | HTML table + dropdown | Rows: cost multiples. Columns: Investment (= legal costs), E[MOIC], E[IRR], P(Loss), E[Net Return], P(Hurdle). Dropdown for Award Ratio. Color-coded |</w:t>
+      </w:r>
+    </w:p>
+    <w:p>
+      <w:r>
+        <w:t>| 9 | **Cross-Claim Comparison: IRR &amp; MOIC** | Dual-axis bar chart | X: Claim ID. Left Y: E[MOIC] (bars). Right Y: E[IRR] (bars). Dropdowns for Cost Multiple and Award Ratio |</w:t>
       </w:r>
     </w:p>
     <w:p/>
@@ -208,15 +138,7 @@
     </w:p>
     <w:p>
       <w:r>
-        <w:t xml:space="preserve">| 1 | **Input Probability Parameters** | 4-KPI row | </w:t>
-      </w:r>
-      <w:proofErr w:type="gramStart"/>
-      <w:r>
-        <w:t>P(</w:t>
-      </w:r>
-      <w:proofErr w:type="gramEnd"/>
-      <w:r>
-        <w:t>Arb Win), P(Re-Arb Win), E[Q\|Win], MC Paths |</w:t>
+        <w:t>| 1 | **Input Probability Parameters** | 4-KPI row | P(Arb Win), P(Re-Arb Win), E[Q\|Win], MC Paths |</w:t>
       </w:r>
     </w:p>
     <w:p>
@@ -262,15 +184,7 @@
     <w:p>
       <w:r>
         <w:lastRenderedPageBreak/>
-        <w:t xml:space="preserve">| 10 | **Arb-Win Sensitivity Analysis** | Tornado / line chart | **Unique to Lit Funding**: uses the `sensitivity` data. X: </w:t>
-      </w:r>
-      <w:proofErr w:type="gramStart"/>
-      <w:r>
-        <w:t>P(</w:t>
-      </w:r>
-      <w:proofErr w:type="gramEnd"/>
-      <w:r>
-        <w:t>Arb Win) (0.1–0.9). Lines: E[MOIC], E[IRR], P(Loss). Shows how sensitive fund returns are to arbitration win probability |</w:t>
+        <w:t>| 10 | **Arb-Win Sensitivity Analysis** | Tornado / line chart | **Unique to Lit Funding**: uses the `sensitivity` data. X: P(Arb Win) (0.1–0.9). Lines: E[MOIC], E[IRR], P(Loss). Shows how sensitive fund returns are to arbitration win probability |</w:t>
       </w:r>
     </w:p>
     <w:p>
@@ -336,13 +250,8 @@
     <w:p/>
     <w:p>
       <w:r>
-        <w:t>### TAB 4 — INVESTMENT &amp; WATERFALL ANALYSIS *(replaces "Investment Analysis</w:t>
-      </w:r>
-      <w:proofErr w:type="gramStart"/>
-      <w:r>
-        <w:t>")*</w:t>
-      </w:r>
-      <w:proofErr w:type="gramEnd"/>
+        <w:t>### TAB 4 — INVESTMENT &amp; WATERFALL ANALYSIS *(replaces "Investment Analysis")*</w:t>
+      </w:r>
     </w:p>
     <w:p/>
     <w:p>
@@ -362,29 +271,13 @@
     </w:p>
     <w:p>
       <w:r>
-        <w:t xml:space="preserve">| 2 | **Funding Waterfall Flow** | Visual flow diagram | Legal Costs (investment) → Collected Award → </w:t>
-      </w:r>
-      <w:proofErr w:type="gramStart"/>
-      <w:r>
-        <w:t>min(</w:t>
-      </w:r>
-      <w:proofErr w:type="gramEnd"/>
-      <w:r>
-        <w:t>CM × Legal, AR × Collected) → Fund Return → Net Profit. Horizontal stacked bar breakdown |</w:t>
+        <w:t>| 2 | **Funding Waterfall Flow** | Visual flow diagram | Legal Costs (investment) → Collected Award → min(CM × Legal, AR × Collected) → Fund Return → Net Profit. Horizontal stacked bar breakdown |</w:t>
       </w:r>
     </w:p>
     <w:p>
       <w:r>
         <w:lastRenderedPageBreak/>
-        <w:t xml:space="preserve">| 3 | **Per-Claim Funding Analytics Table** | HTML table | Claim, Jurisdiction, </w:t>
-      </w:r>
-      <w:proofErr w:type="gramStart"/>
-      <w:r>
-        <w:t>E[</w:t>
-      </w:r>
-      <w:proofErr w:type="gramEnd"/>
-      <w:r>
-        <w:t>Legal Cost], E[Collected], Fund Share @ selected CM/AR, E[Return], E[Net], Return/Legal-Cost ratio |</w:t>
+        <w:t>| 3 | **Per-Claim Funding Analytics Table** | HTML table | Claim, Jurisdiction, E[Legal Cost], E[Collected], Fund Share @ selected CM/AR, E[Return], E[Net], Return/Legal-Cost ratio |</w:t>
       </w:r>
     </w:p>
     <w:p>
@@ -420,15 +313,7 @@
     </w:p>
     <w:p>
       <w:r>
-        <w:t xml:space="preserve">| 7 | **Cost Multiple Selector Buttons** | Button group | Selects a CM row — updates </w:t>
-      </w:r>
-      <w:proofErr w:type="gramStart"/>
-      <w:r>
-        <w:t>charts</w:t>
-      </w:r>
-      <w:proofErr w:type="gramEnd"/>
-      <w:r>
-        <w:t xml:space="preserve"> below |</w:t>
+        <w:t>| 7 | **Cost Multiple Selector Buttons** | Button group | Selects a CM row — updates charts below |</w:t>
       </w:r>
     </w:p>
     <w:p>
@@ -478,15 +363,7 @@
       </w:r>
       <w:proofErr w:type="spellEnd"/>
       <w:r>
-        <w:t xml:space="preserve"> Duration. Row 2: </w:t>
-      </w:r>
-      <w:proofErr w:type="gramStart"/>
-      <w:r>
-        <w:t>E[</w:t>
-      </w:r>
-      <w:proofErr w:type="gramEnd"/>
-      <w:r>
-        <w:t>Legal Cost], E[Collected], Fund Share, E[Net] |</w:t>
+        <w:t xml:space="preserve"> Duration. Row 2: E[Legal Cost], E[Collected], Fund Share, E[Net] |</w:t>
       </w:r>
     </w:p>
     <w:p>
@@ -508,13 +385,8 @@
     <w:p/>
     <w:p>
       <w:r>
-        <w:t xml:space="preserve">### TAB 6 — LEGAL COSTS *(Critical for Lit Funding — costs = </w:t>
-      </w:r>
-      <w:proofErr w:type="gramStart"/>
-      <w:r>
-        <w:t>investment)*</w:t>
-      </w:r>
-      <w:proofErr w:type="gramEnd"/>
+        <w:t>### TAB 6 — LEGAL COSTS *(Critical for Lit Funding — costs = investment)*</w:t>
+      </w:r>
     </w:p>
     <w:p/>
     <w:p>
@@ -586,15 +458,7 @@
     </w:p>
     <w:p>
       <w:r>
-        <w:t xml:space="preserve">| 1 | **Portfolio KPI Cards** | 6 KPIs | Total Legal Costs, E[Collected], </w:t>
-      </w:r>
-      <w:proofErr w:type="gramStart"/>
-      <w:r>
-        <w:t>E[</w:t>
-      </w:r>
-      <w:proofErr w:type="gramEnd"/>
-      <w:r>
-        <w:t xml:space="preserve">Fund Return], E[Net Profit], </w:t>
+        <w:t xml:space="preserve">| 1 | **Portfolio KPI Cards** | 6 KPIs | Total Legal Costs, E[Collected], E[Fund Return], E[Net Profit], </w:t>
       </w:r>
       <w:proofErr w:type="spellStart"/>
       <w:r>
@@ -615,29 +479,13 @@
     </w:p>
     <w:p>
       <w:r>
-        <w:t xml:space="preserve">| 2 | **J-Curve Fan Chart** | </w:t>
-      </w:r>
-      <w:proofErr w:type="gramStart"/>
-      <w:r>
-        <w:t>Multi-line</w:t>
-      </w:r>
-      <w:proofErr w:type="gramEnd"/>
-      <w:r>
-        <w:t xml:space="preserve"> fan + sliders | X: Months. Y: Cumulative cashflow. Bands P10–P90. Sliders: Cost Multiple + Award Ratio |</w:t>
+        <w:t>| 2 | **J-Curve Fan Chart** | Multi-line fan + sliders | X: Months. Y: Cumulative cashflow. Bands P10–P90. Sliders: Cost Multiple + Award Ratio |</w:t>
       </w:r>
     </w:p>
     <w:p>
       <w:r>
         <w:lastRenderedPageBreak/>
-        <w:t xml:space="preserve">| 3 | **Annual Resolution &amp; Recovery Timeline** | Two side-by-side charts | Chart A: % claims resolving each year + cumulative. Chart B: </w:t>
-      </w:r>
-      <w:proofErr w:type="gramStart"/>
-      <w:r>
-        <w:t>E[</w:t>
-      </w:r>
-      <w:proofErr w:type="gramEnd"/>
-      <w:r>
-        <w:t>Fund Return] per year + cumulative |</w:t>
+        <w:t>| 3 | **Annual Resolution &amp; Recovery Timeline** | Two side-by-side charts | Chart A: % claims resolving each year + cumulative. Chart B: E[Fund Return] per year + cumulative |</w:t>
       </w:r>
     </w:p>
     <w:p>
@@ -647,15 +495,7 @@
     </w:p>
     <w:p>
       <w:r>
-        <w:t xml:space="preserve">| 5 | **Per-Claim Expected Cashflow Table** | HTML table | Claim, </w:t>
-      </w:r>
-      <w:proofErr w:type="gramStart"/>
-      <w:r>
-        <w:t>E[</w:t>
-      </w:r>
-      <w:proofErr w:type="gramEnd"/>
-      <w:r>
-        <w:t>Legal Cost], E[Collected], E[Fund Return], P5/P50/P95, E[Duration]. Portfolio total |</w:t>
+        <w:t>| 5 | **Per-Claim Expected Cashflow Table** | HTML table | Claim, E[Legal Cost], E[Collected], E[Fund Return], P5/P50/P95, E[Duration]. Portfolio total |</w:t>
       </w:r>
     </w:p>
     <w:p>
@@ -665,27 +505,14 @@
     </w:p>
     <w:p>
       <w:r>
-        <w:t xml:space="preserve">| 7 | **Funding Scenario Cashflows** | HTML table | Key CM/AR combos: Investment, </w:t>
-      </w:r>
-      <w:proofErr w:type="gramStart"/>
-      <w:r>
-        <w:t>E[</w:t>
-      </w:r>
-      <w:proofErr w:type="gramEnd"/>
-      <w:r>
-        <w:t>Fund Return], E[Net], E[MOIC], P(Loss) |</w:t>
-      </w:r>
-    </w:p>
-    <w:p/>
-    <w:p>
-      <w:r>
-        <w:t xml:space="preserve">### TAB 8 — ARB-WIN SENSITIVITY *(replaces Stochastic Pricing — not available for Lit </w:t>
-      </w:r>
-      <w:proofErr w:type="gramStart"/>
-      <w:r>
-        <w:t>Funding)*</w:t>
-      </w:r>
-      <w:proofErr w:type="gramEnd"/>
+        <w:t>| 7 | **Funding Scenario Cashflows** | HTML table | Key CM/AR combos: Investment, E[Fund Return], E[Net], E[MOIC], P(Loss) |</w:t>
+      </w:r>
+    </w:p>
+    <w:p/>
+    <w:p>
+      <w:r>
+        <w:t>### TAB 8 — ARB-WIN SENSITIVITY *(replaces Stochastic Pricing — not available for Lit Funding)*</w:t>
+      </w:r>
     </w:p>
     <w:p/>
     <w:p>
@@ -700,67 +527,27 @@
     </w:p>
     <w:p>
       <w:r>
-        <w:t xml:space="preserve">| 1 | **Sensitivity KPIs** | 4 KPIs | Base </w:t>
-      </w:r>
-      <w:proofErr w:type="gramStart"/>
-      <w:r>
-        <w:t>P(</w:t>
-      </w:r>
-      <w:proofErr w:type="gramEnd"/>
-      <w:r>
-        <w:t>Arb Win), Sensitivity Range, # Grid Points, Selected CM/AR |</w:t>
-      </w:r>
-    </w:p>
-    <w:p>
-      <w:r>
-        <w:t xml:space="preserve">| 2 | **E[MOIC] vs </w:t>
-      </w:r>
-      <w:proofErr w:type="gramStart"/>
-      <w:r>
-        <w:t>P(</w:t>
-      </w:r>
-      <w:proofErr w:type="gramEnd"/>
-      <w:r>
-        <w:t>Arb Win)** | Line chart with confidence band | X: P(Arb Win). Y: E[MOIC]. Band: P25–P75. Multiple lines for different CM/AR combos |</w:t>
-      </w:r>
-    </w:p>
-    <w:p>
-      <w:r>
-        <w:t xml:space="preserve">| 3 | **P(Loss) vs </w:t>
-      </w:r>
-      <w:proofErr w:type="gramStart"/>
-      <w:r>
-        <w:t>P(</w:t>
-      </w:r>
-      <w:proofErr w:type="gramEnd"/>
-      <w:r>
-        <w:t>Arb Win)** | Line chart | Same X-axis, Y: P(Loss). Shows how portfolio loss probability varies |</w:t>
-      </w:r>
-    </w:p>
-    <w:p>
-      <w:r>
-        <w:t xml:space="preserve">| 4 | **E[IRR] vs </w:t>
-      </w:r>
-      <w:proofErr w:type="gramStart"/>
-      <w:r>
-        <w:t>P(</w:t>
-      </w:r>
-      <w:proofErr w:type="gramEnd"/>
-      <w:r>
-        <w:t>Arb Win)** | Line chart | |</w:t>
-      </w:r>
-    </w:p>
-    <w:p>
-      <w:r>
-        <w:t xml:space="preserve">| 5 | **Breakeven </w:t>
-      </w:r>
-      <w:proofErr w:type="gramStart"/>
-      <w:r>
-        <w:t>P(</w:t>
-      </w:r>
-      <w:proofErr w:type="gramEnd"/>
-      <w:r>
-        <w:t>Arb Win)** | **NEW: Highlighted metric** | The minimum P(Arb Win) needed for E[MOIC] ≥ 1.0 at each CM/AR combo. Critical decision metric |</w:t>
+        <w:t>| 1 | **Sensitivity KPIs** | 4 KPIs | Base P(Arb Win), Sensitivity Range, # Grid Points, Selected CM/AR |</w:t>
+      </w:r>
+    </w:p>
+    <w:p>
+      <w:r>
+        <w:t>| 2 | **E[MOIC] vs P(Arb Win)** | Line chart with confidence band | X: P(Arb Win). Y: E[MOIC]. Band: P25–P75. Multiple lines for different CM/AR combos |</w:t>
+      </w:r>
+    </w:p>
+    <w:p>
+      <w:r>
+        <w:t>| 3 | **P(Loss) vs P(Arb Win)** | Line chart | Same X-axis, Y: P(Loss). Shows how portfolio loss probability varies |</w:t>
+      </w:r>
+    </w:p>
+    <w:p>
+      <w:r>
+        <w:t>| 4 | **E[IRR] vs P(Arb Win)** | Line chart | |</w:t>
+      </w:r>
+    </w:p>
+    <w:p>
+      <w:r>
+        <w:t>| 5 | **Breakeven P(Arb Win)** | **NEW: Highlighted metric** | The minimum P(Arb Win) needed for E[MOIC] ≥ 1.0 at each CM/AR combo. Critical decision metric |</w:t>
       </w:r>
     </w:p>
     <w:p>
@@ -779,13 +566,8 @@
     <w:p/>
     <w:p>
       <w:r>
-        <w:t xml:space="preserve">### TAB 9 — PRICING SURFACE *(adapted: CM × AR instead of Upfront × </w:t>
-      </w:r>
-      <w:proofErr w:type="gramStart"/>
-      <w:r>
-        <w:t>Tail)*</w:t>
-      </w:r>
-      <w:proofErr w:type="gramEnd"/>
+        <w:t>### TAB 9 — PRICING SURFACE *(adapted: CM × AR instead of Upfront × Tail)*</w:t>
+      </w:r>
     </w:p>
     <w:p/>
     <w:p>
@@ -806,15 +588,7 @@
     </w:p>
     <w:p>
       <w:r>
-        <w:t xml:space="preserve">| 2 | **Controls** | Sliders + mode buttons + dropdown | Cost Multiple </w:t>
-      </w:r>
-      <w:proofErr w:type="gramStart"/>
-      <w:r>
-        <w:t>slider</w:t>
-      </w:r>
-      <w:proofErr w:type="gramEnd"/>
-      <w:r>
-        <w:t>, Award Ratio slider, View Mode (Heatmap/Contour/3D Surface), Metric dropdown (E[IRR], E[MOIC], Median, P5, CVaR, P(Loss), P(Hurdle), etc.) |</w:t>
+        <w:t>| 2 | **Controls** | Sliders + mode buttons + dropdown | Cost Multiple slider, Award Ratio slider, View Mode (Heatmap/Contour/3D Surface), Metric dropdown (E[IRR], E[MOIC], Median, P5, CVaR, P(Loss), P(Hurdle), etc.) |</w:t>
       </w:r>
     </w:p>
     <w:p>
@@ -898,15 +672,7 @@
     </w:p>
     <w:p>
       <w:r>
-        <w:t xml:space="preserve">| 2 | **E[MOIC] vs Cost Multiple** | </w:t>
-      </w:r>
-      <w:proofErr w:type="gramStart"/>
-      <w:r>
-        <w:t>Multi-line</w:t>
-      </w:r>
-      <w:proofErr w:type="gramEnd"/>
-      <w:r>
-        <w:t xml:space="preserve"> chart (white </w:t>
+        <w:t xml:space="preserve">| 2 | **E[MOIC] vs Cost Multiple** | Multi-line chart (white </w:t>
       </w:r>
       <w:proofErr w:type="spellStart"/>
       <w:r>
@@ -919,28 +685,12 @@
     </w:p>
     <w:p>
       <w:r>
-        <w:t xml:space="preserve">| 3 | **E[IRR] vs Cost Multiple** | </w:t>
-      </w:r>
-      <w:proofErr w:type="gramStart"/>
-      <w:r>
-        <w:t>Multi-line</w:t>
-      </w:r>
-      <w:proofErr w:type="gramEnd"/>
-      <w:r>
-        <w:t xml:space="preserve"> chart | Reference: 30% hurdle |</w:t>
-      </w:r>
-    </w:p>
-    <w:p>
-      <w:r>
-        <w:t xml:space="preserve">| 4 | **P(Loss) vs Cost Multiple** | </w:t>
-      </w:r>
-      <w:proofErr w:type="gramStart"/>
-      <w:r>
-        <w:t>Multi-line</w:t>
-      </w:r>
-      <w:proofErr w:type="gramEnd"/>
-      <w:r>
-        <w:t xml:space="preserve"> chart | Reference: 20% threshold |</w:t>
+        <w:t>| 3 | **E[IRR] vs Cost Multiple** | Multi-line chart | Reference: 30% hurdle |</w:t>
+      </w:r>
+    </w:p>
+    <w:p>
+      <w:r>
+        <w:t>| 4 | **P(Loss) vs Cost Multiple** | Multi-line chart | Reference: 20% threshold |</w:t>
       </w:r>
     </w:p>
     <w:p/>
@@ -958,15 +708,7 @@
     <w:p/>
     <w:p>
       <w:r>
-        <w:t xml:space="preserve">&gt; **Core investor </w:t>
-      </w:r>
-      <w:proofErr w:type="gramStart"/>
-      <w:r>
-        <w:t>question:*</w:t>
-      </w:r>
-      <w:proofErr w:type="gramEnd"/>
-      <w:r>
-        <w:t>* "I'm buying claims outright at X% of SOC and sharing Y% of the award with the seller. What purchase price and award share maximise my return?"</w:t>
+        <w:t>&gt; **Core investor question:** "I'm buying claims outright at X% of SOC and sharing Y% of the award with the seller. What purchase price and award share maximise my return?"</w:t>
       </w:r>
     </w:p>
     <w:p/>
@@ -1001,15 +743,7 @@
       </w:r>
       <w:proofErr w:type="spellEnd"/>
       <w:r>
-        <w:t xml:space="preserve"> Win Rate, Total Investment (= Upfront), E[Collected], </w:t>
-      </w:r>
-      <w:proofErr w:type="gramStart"/>
-      <w:r>
-        <w:t>E[</w:t>
-      </w:r>
-      <w:proofErr w:type="gramEnd"/>
-      <w:r>
-        <w:t>Net to Fund], E[Net Profit] |</w:t>
+        <w:t xml:space="preserve"> Win Rate, Total Investment (= Upfront), E[Collected], E[Net to Fund], E[Net Profit] |</w:t>
       </w:r>
     </w:p>
     <w:p>
@@ -1022,15 +756,7 @@
       </w:r>
       <w:proofErr w:type="spellEnd"/>
       <w:r>
-        <w:t xml:space="preserve"> Duration, </w:t>
-      </w:r>
-      <w:proofErr w:type="gramStart"/>
-      <w:r>
-        <w:t>E[</w:t>
-      </w:r>
-      <w:proofErr w:type="gramEnd"/>
-      <w:r>
-        <w:t>Legal Costs], Best MOIC, Purchase Price (₹ Cr) |</w:t>
+        <w:t xml:space="preserve"> Duration, E[Legal Costs], Best MOIC, Purchase Price (₹ Cr) |</w:t>
       </w:r>
     </w:p>
     <w:p>
@@ -1040,15 +766,7 @@
     </w:p>
     <w:p>
       <w:r>
-        <w:t xml:space="preserve">| 5 | **J-Curve Fan Chart** | </w:t>
-      </w:r>
-      <w:proofErr w:type="gramStart"/>
-      <w:r>
-        <w:t>Multi-line</w:t>
-      </w:r>
-      <w:proofErr w:type="gramEnd"/>
-      <w:r>
-        <w:t xml:space="preserve"> fan | Cumulative cashflow P10–P90 |</w:t>
+        <w:t>| 5 | **J-Curve Fan Chart** | Multi-line fan | Cumulative cashflow P10–P90 |</w:t>
       </w:r>
     </w:p>
     <w:p>
@@ -1063,28 +781,12 @@
     </w:p>
     <w:p>
       <w:r>
-        <w:t xml:space="preserve">| 8 | **Purchase Scenario Summary** | HTML table + dropdown | Rows: Upfront %. Cols: Investment, E[MOIC], E[IRR], P(Loss), </w:t>
-      </w:r>
-      <w:proofErr w:type="gramStart"/>
-      <w:r>
-        <w:t>E[</w:t>
-      </w:r>
-      <w:proofErr w:type="gramEnd"/>
-      <w:r>
-        <w:t>Net Return], P(Hurdle). Dropdown for Award Share % |</w:t>
-      </w:r>
-    </w:p>
-    <w:p>
-      <w:r>
-        <w:t>| 9 | **</w:t>
-      </w:r>
-      <w:proofErr w:type="gramStart"/>
-      <w:r>
-        <w:t>Cross-Claim</w:t>
-      </w:r>
-      <w:proofErr w:type="gramEnd"/>
-      <w:r>
-        <w:t xml:space="preserve"> Comparison: IRR &amp; MOIC** | Dual-axis bar | Per claim. Dropdowns for Upfront + Award Share |</w:t>
+        <w:t>| 8 | **Purchase Scenario Summary** | HTML table + dropdown | Rows: Upfront %. Cols: Investment, E[MOIC], E[IRR], P(Loss), E[Net Return], P(Hurdle). Dropdown for Award Share % |</w:t>
+      </w:r>
+    </w:p>
+    <w:p>
+      <w:r>
+        <w:t>| 9 | **Cross-Claim Comparison: IRR &amp; MOIC** | Dual-axis bar | Per claim. Dropdowns for Upfront + Award Share |</w:t>
       </w:r>
     </w:p>
     <w:p/>
@@ -1096,13 +798,8 @@
     <w:p/>
     <w:p>
       <w:r>
-        <w:t xml:space="preserve">*(Same as Upfront-Tail Tab 2 — identical probability </w:t>
-      </w:r>
-      <w:proofErr w:type="gramStart"/>
-      <w:r>
-        <w:t>engine)*</w:t>
-      </w:r>
-      <w:proofErr w:type="gramEnd"/>
+        <w:t>*(Same as Upfront-Tail Tab 2 — identical probability engine)*</w:t>
+      </w:r>
     </w:p>
     <w:p/>
     <w:p>
@@ -1129,13 +826,8 @@
     <w:p/>
     <w:p>
       <w:r>
-        <w:t xml:space="preserve">*(Same structure as Upfront-Tail Tab </w:t>
-      </w:r>
-      <w:proofErr w:type="gramStart"/>
-      <w:r>
-        <w:t>3)*</w:t>
-      </w:r>
-      <w:proofErr w:type="gramEnd"/>
+        <w:t>*(Same structure as Upfront-Tail Tab 3)*</w:t>
+      </w:r>
     </w:p>
     <w:p/>
     <w:p>
@@ -1217,23 +909,7 @@
     </w:p>
     <w:p>
       <w:r>
-        <w:t xml:space="preserve">| 10 | **Ownership Economics Table** | **NEW: HTML table** | Award Share % → Fund's effective ownership → </w:t>
-      </w:r>
-      <w:proofErr w:type="gramStart"/>
-      <w:r>
-        <w:t>E[</w:t>
-      </w:r>
-      <w:proofErr w:type="gramEnd"/>
-      <w:r>
-        <w:t xml:space="preserve">Return per ₹ invested] → Implied portfolio value multiple. Transparent look at what you're </w:t>
-      </w:r>
-      <w:proofErr w:type="gramStart"/>
-      <w:r>
-        <w:t>actually buying</w:t>
-      </w:r>
-      <w:proofErr w:type="gramEnd"/>
-      <w:r>
-        <w:t xml:space="preserve"> |</w:t>
+        <w:t>| 10 | **Ownership Economics Table** | **NEW: HTML table** | Award Share % → Fund's effective ownership → E[Return per ₹ invested] → Implied portfolio value multiple. Transparent look at what you're actually buying |</w:t>
       </w:r>
     </w:p>
     <w:p/>
@@ -1292,13 +968,8 @@
     <w:p/>
     <w:p>
       <w:r>
-        <w:t xml:space="preserve">*(Same as Upfront-Tail Tab </w:t>
-      </w:r>
-      <w:proofErr w:type="gramStart"/>
-      <w:r>
-        <w:t>6)*</w:t>
-      </w:r>
-      <w:proofErr w:type="gramEnd"/>
+        <w:t>*(Same as Upfront-Tail Tab 6)*</w:t>
+      </w:r>
     </w:p>
     <w:p/>
     <w:p>
@@ -1319,15 +990,7 @@
     </w:p>
     <w:p>
       <w:r>
-        <w:t xml:space="preserve">| 1 | **Portfolio KPI Cards** | 6 KPIs | Total SOC, Purchase Price, E[Collected], </w:t>
-      </w:r>
-      <w:proofErr w:type="gramStart"/>
-      <w:r>
-        <w:t>E[</w:t>
-      </w:r>
-      <w:proofErr w:type="gramEnd"/>
-      <w:r>
-        <w:t xml:space="preserve">Legal Costs], E[Net Cashflow], P(Win) </w:t>
+        <w:t xml:space="preserve">| 1 | **Portfolio KPI Cards** | 6 KPIs | Total SOC, Purchase Price, E[Collected], E[Legal Costs], E[Net Cashflow], P(Win) </w:t>
       </w:r>
       <w:proofErr w:type="spellStart"/>
       <w:r>
@@ -1522,41 +1185,17 @@
     </w:p>
     <w:p>
       <w:r>
-        <w:t xml:space="preserve">| 2 | **E[MOIC] vs Upfront %** | </w:t>
-      </w:r>
-      <w:proofErr w:type="gramStart"/>
-      <w:r>
-        <w:t>Multi-line</w:t>
-      </w:r>
-      <w:proofErr w:type="gramEnd"/>
-      <w:r>
-        <w:t xml:space="preserve"> (one per award share) |</w:t>
-      </w:r>
-    </w:p>
-    <w:p>
-      <w:r>
-        <w:t xml:space="preserve">| 3 | **E[IRR] vs Upfront %** | </w:t>
-      </w:r>
-      <w:proofErr w:type="gramStart"/>
-      <w:r>
-        <w:t>Multi-line</w:t>
-      </w:r>
-      <w:proofErr w:type="gramEnd"/>
-      <w:r>
-        <w:t>, 30% hurdle |</w:t>
-      </w:r>
-    </w:p>
-    <w:p>
-      <w:r>
-        <w:t xml:space="preserve">| 4 | **P(Loss) vs Upfront %** | </w:t>
-      </w:r>
-      <w:proofErr w:type="gramStart"/>
-      <w:r>
-        <w:t>Multi-line</w:t>
-      </w:r>
-      <w:proofErr w:type="gramEnd"/>
-      <w:r>
-        <w:t>, 20% threshold |</w:t>
+        <w:t>| 2 | **E[MOIC] vs Upfront %** | Multi-line (one per award share) |</w:t>
+      </w:r>
+    </w:p>
+    <w:p>
+      <w:r>
+        <w:t>| 3 | **E[IRR] vs Upfront %** | Multi-line, 30% hurdle |</w:t>
+      </w:r>
+    </w:p>
+    <w:p>
+      <w:r>
+        <w:t>| 4 | **P(Loss) vs Upfront %** | Multi-line, 20% threshold |</w:t>
       </w:r>
     </w:p>
     <w:p/>
@@ -1574,15 +1213,7 @@
     <w:p/>
     <w:p>
       <w:r>
-        <w:t xml:space="preserve">&gt; **Core investor </w:t>
-      </w:r>
-      <w:proofErr w:type="gramStart"/>
-      <w:r>
-        <w:t>question:*</w:t>
-      </w:r>
-      <w:proofErr w:type="gramEnd"/>
-      <w:r>
-        <w:t>* "I'm structuring my investment as staged milestone payments triggered by case progress events. How does staging reduce my downside vs a lump-sum purchase, and what returns can I expect?"</w:t>
+        <w:t>&gt; **Core investor question:** "I'm structuring my investment as staged milestone payments triggered by case progress events. How does staging reduce my downside vs a lump-sum purchase, and what returns can I expect?"</w:t>
       </w:r>
     </w:p>
     <w:p/>
@@ -1605,14 +1236,9 @@
     </w:p>
     <w:p>
       <w:r>
-        <w:t xml:space="preserve">| 1 | **Staged Payment Economics** | Expandable formula card | Total Investment = </w:t>
-      </w:r>
-      <w:proofErr w:type="gramStart"/>
-      <w:r>
-        <w:t>Σ(</w:t>
-      </w:r>
-      <w:proofErr w:type="spellStart"/>
-      <w:proofErr w:type="gramEnd"/>
+        <w:t>| 1 | **Staged Payment Economics** | Expandable formula card | Total Investment = Σ(</w:t>
+      </w:r>
+      <w:proofErr w:type="spellStart"/>
       <w:r>
         <w:t>Milestone_i</w:t>
       </w:r>
@@ -1639,28 +1265,12 @@
       </w:r>
       <w:proofErr w:type="spellEnd"/>
       <w:r>
-        <w:t xml:space="preserve"> Win Rate, Total E[Investment] (staged sum), E[Collected], </w:t>
-      </w:r>
-      <w:proofErr w:type="gramStart"/>
-      <w:r>
-        <w:t>E[</w:t>
-      </w:r>
-      <w:proofErr w:type="gramEnd"/>
-      <w:r>
-        <w:t>Net to Fund], E[Net Profit] |</w:t>
-      </w:r>
-    </w:p>
-    <w:p>
-      <w:r>
-        <w:t xml:space="preserve">| 3 | **Supporting Metrics KPIs** | 4-column row | # Milestones, </w:t>
-      </w:r>
-      <w:proofErr w:type="gramStart"/>
-      <w:r>
-        <w:t>E[</w:t>
-      </w:r>
-      <w:proofErr w:type="gramEnd"/>
-      <w:r>
-        <w:t xml:space="preserve">Milestones Triggered], </w:t>
+        <w:t xml:space="preserve"> Win Rate, Total E[Investment] (staged sum), E[Collected], E[Net to Fund], E[Net Profit] |</w:t>
+      </w:r>
+    </w:p>
+    <w:p>
+      <w:r>
+        <w:t xml:space="preserve">| 3 | **Supporting Metrics KPIs** | 4-column row | # Milestones, E[Milestones Triggered], </w:t>
       </w:r>
       <w:proofErr w:type="spellStart"/>
       <w:r>
@@ -1678,15 +1288,7 @@
     </w:p>
     <w:p>
       <w:r>
-        <w:t xml:space="preserve">| 5 | **J-Curve Fan Chart** | </w:t>
-      </w:r>
-      <w:proofErr w:type="gramStart"/>
-      <w:r>
-        <w:t>Multi-line</w:t>
-      </w:r>
-      <w:proofErr w:type="gramEnd"/>
-      <w:r>
-        <w:t xml:space="preserve"> fan | Cumulative cashflow — step-function outflows at milestone dates overlaid with recovery inflows |</w:t>
+        <w:t>| 5 | **J-Curve Fan Chart** | Multi-line fan | Cumulative cashflow — step-function outflows at milestone dates overlaid with recovery inflows |</w:t>
       </w:r>
     </w:p>
     <w:p>
@@ -1706,27 +1308,14 @@
     </w:p>
     <w:p>
       <w:r>
-        <w:t>| 9 | **</w:t>
-      </w:r>
-      <w:proofErr w:type="gramStart"/>
-      <w:r>
-        <w:t>Cross-Claim</w:t>
-      </w:r>
-      <w:proofErr w:type="gramEnd"/>
-      <w:r>
-        <w:t xml:space="preserve"> Comparison** | Dual-axis bar | Per claim MOIC/IRR with dropdown |</w:t>
-      </w:r>
-    </w:p>
-    <w:p/>
-    <w:p>
-      <w:r>
-        <w:t xml:space="preserve">### TAB 2 — MILESTONE ANALYSIS *(NEW — Unique to </w:t>
-      </w:r>
-      <w:proofErr w:type="gramStart"/>
-      <w:r>
-        <w:t>Staged)*</w:t>
-      </w:r>
-      <w:proofErr w:type="gramEnd"/>
+        <w:t>| 9 | **Cross-Claim Comparison** | Dual-axis bar | Per claim MOIC/IRR with dropdown |</w:t>
+      </w:r>
+    </w:p>
+    <w:p/>
+    <w:p>
+      <w:r>
+        <w:t>### TAB 2 — MILESTONE ANALYSIS *(NEW — Unique to Staged)*</w:t>
+      </w:r>
     </w:p>
     <w:p/>
     <w:p>
@@ -1741,15 +1330,7 @@
     </w:p>
     <w:p>
       <w:r>
-        <w:t xml:space="preserve">| 1 | **Milestone Summary KPIs** | 5-column row | # Milestones, Total Committed, E[Deployed], Deployment Ratio, </w:t>
-      </w:r>
-      <w:proofErr w:type="gramStart"/>
-      <w:r>
-        <w:t>E[</w:t>
-      </w:r>
-      <w:proofErr w:type="gramEnd"/>
-      <w:r>
-        <w:t>Cost Savings vs Lump Sum] |</w:t>
+        <w:t>| 1 | **Milestone Summary KPIs** | 5-column row | # Milestones, Total Committed, E[Deployed], Deployment Ratio, E[Cost Savings vs Lump Sum] |</w:t>
       </w:r>
     </w:p>
     <w:p>
@@ -1762,15 +1343,7 @@
       </w:r>
       <w:proofErr w:type="spellEnd"/>
       <w:r>
-        <w:t xml:space="preserve">: payment size. Shows when capital </w:t>
-      </w:r>
-      <w:proofErr w:type="gramStart"/>
-      <w:r>
-        <w:t>actually gets</w:t>
-      </w:r>
-      <w:proofErr w:type="gramEnd"/>
-      <w:r>
-        <w:t xml:space="preserve"> deployed |</w:t>
+        <w:t>: payment size. Shows when capital actually gets deployed |</w:t>
       </w:r>
     </w:p>
     <w:p>
@@ -1781,15 +1354,7 @@
     <w:p>
       <w:r>
         <w:lastRenderedPageBreak/>
-        <w:t xml:space="preserve">| 4 | **Capital Deployment Probability** | Stacked bar chart | X: Total capital deployed (bands). Y: Probability. Shows distribution of how much capital </w:t>
-      </w:r>
-      <w:proofErr w:type="gramStart"/>
-      <w:r>
-        <w:t>actually goes</w:t>
-      </w:r>
-      <w:proofErr w:type="gramEnd"/>
-      <w:r>
-        <w:t xml:space="preserve"> out the door. Key insight: staged means you might pay less than committed |</w:t>
+        <w:t>| 4 | **Capital Deployment Probability** | Stacked bar chart | X: Total capital deployed (bands). Y: Probability. Shows distribution of how much capital actually goes out the door. Key insight: staged means you might pay less than committed |</w:t>
       </w:r>
     </w:p>
     <w:p>
@@ -1799,15 +1364,7 @@
     </w:p>
     <w:p>
       <w:r>
-        <w:t xml:space="preserve">| 6 | **Staged vs Lump-Sum Comparison** | **NEW: Side-by-side KPI cards** | E[MOIC] Staged vs Lump Sum, E[IRR] Staged vs Lump Sum, P(Loss) Staged vs Lump Sum, </w:t>
-      </w:r>
-      <w:proofErr w:type="gramStart"/>
-      <w:r>
-        <w:t>E[</w:t>
-      </w:r>
-      <w:proofErr w:type="gramEnd"/>
-      <w:r>
-        <w:t>Capital Deployed] Staged vs Committed. Shows the staging advantage quantified |</w:t>
+        <w:t>| 6 | **Staged vs Lump-Sum Comparison** | **NEW: Side-by-side KPI cards** | E[MOIC] Staged vs Lump Sum, E[IRR] Staged vs Lump Sum, P(Loss) Staged vs Lump Sum, E[Capital Deployed] Staged vs Committed. Shows the staging advantage quantified |</w:t>
       </w:r>
     </w:p>
     <w:p>
@@ -1824,13 +1381,8 @@
     <w:p/>
     <w:p>
       <w:r>
-        <w:t xml:space="preserve">*(Same as Upfront-Tail Tab </w:t>
-      </w:r>
-      <w:proofErr w:type="gramStart"/>
-      <w:r>
-        <w:t>2)*</w:t>
-      </w:r>
-      <w:proofErr w:type="gramEnd"/>
+        <w:t>*(Same as Upfront-Tail Tab 2)*</w:t>
+      </w:r>
     </w:p>
     <w:p/>
     <w:p>
@@ -1841,13 +1393,8 @@
     <w:p/>
     <w:p>
       <w:r>
-        <w:t xml:space="preserve">*(Same as Upfront-Tail Tab </w:t>
-      </w:r>
-      <w:proofErr w:type="gramStart"/>
-      <w:r>
-        <w:t>3)*</w:t>
-      </w:r>
-      <w:proofErr w:type="gramEnd"/>
+        <w:t>*(Same as Upfront-Tail Tab 3)*</w:t>
+      </w:r>
     </w:p>
     <w:p/>
     <w:p>
@@ -1868,15 +1415,7 @@
     </w:p>
     <w:p>
       <w:r>
-        <w:t xml:space="preserve">| 1 | **Investment Statistics KPI Grid** | 8 KPIs | Total Committed, E[Deployed], Best E[MOIC], Best E[IRR], Best P(Loss), </w:t>
-      </w:r>
-      <w:proofErr w:type="gramStart"/>
-      <w:r>
-        <w:t>E[</w:t>
-      </w:r>
-      <w:proofErr w:type="gramEnd"/>
-      <w:r>
-        <w:t>Capital Efficiency] (MOIC per ₹ deployed), Sweet Spot, Max Breakeven |</w:t>
+        <w:t>| 1 | **Investment Statistics KPI Grid** | 8 KPIs | Total Committed, E[Deployed], Best E[MOIC], Best E[IRR], Best P(Loss), E[Capital Efficiency] (MOIC per ₹ deployed), Sweet Spot, Max Breakeven |</w:t>
       </w:r>
     </w:p>
     <w:p>
@@ -1925,15 +1464,7 @@
     </w:p>
     <w:p>
       <w:r>
-        <w:t xml:space="preserve">| 9 | **Capital Efficiency Frontier** | **NEW: Scatter + Pareto front** | X: </w:t>
-      </w:r>
-      <w:proofErr w:type="gramStart"/>
-      <w:r>
-        <w:t>E[</w:t>
-      </w:r>
-      <w:proofErr w:type="gramEnd"/>
-      <w:r>
-        <w:t>Capital Deployed]. Y: E[MOIC]. Each dot = one grid combo. Pareto frontier highlighted: maximum MOIC for each deployment level. Helps investor find most capital-efficient structure |</w:t>
+        <w:t>| 9 | **Capital Efficiency Frontier** | **NEW: Scatter + Pareto front** | X: E[Capital Deployed]. Y: E[MOIC]. Each dot = one grid combo. Pareto frontier highlighted: maximum MOIC for each deployment level. Helps investor find most capital-efficient structure |</w:t>
       </w:r>
     </w:p>
     <w:p/>
@@ -1992,13 +1523,8 @@
     <w:p/>
     <w:p>
       <w:r>
-        <w:t xml:space="preserve">*(Same as Upfront-Tail Tab </w:t>
-      </w:r>
-      <w:proofErr w:type="gramStart"/>
-      <w:r>
-        <w:t>6)*</w:t>
-      </w:r>
-      <w:proofErr w:type="gramEnd"/>
+        <w:t>*(Same as Upfront-Tail Tab 6)*</w:t>
+      </w:r>
     </w:p>
     <w:p/>
     <w:p>
@@ -2067,13 +1593,8 @@
     <w:p/>
     <w:p>
       <w:r>
-        <w:t xml:space="preserve">*(Same as Full Purchase Tab 8 — uses same grid </w:t>
-      </w:r>
-      <w:proofErr w:type="gramStart"/>
-      <w:r>
-        <w:t>engine)*</w:t>
-      </w:r>
-      <w:proofErr w:type="gramEnd"/>
+        <w:t>*(Same as Full Purchase Tab 8 — uses same grid engine)*</w:t>
+      </w:r>
     </w:p>
     <w:p/>
     <w:p>
@@ -2084,13 +1605,8 @@
     <w:p/>
     <w:p>
       <w:r>
-        <w:t xml:space="preserve">*(Same as Full Purchase Tab </w:t>
-      </w:r>
-      <w:proofErr w:type="gramStart"/>
-      <w:r>
-        <w:t>9)*</w:t>
-      </w:r>
-      <w:proofErr w:type="gramEnd"/>
+        <w:t>*(Same as Full Purchase Tab 9)*</w:t>
+      </w:r>
     </w:p>
     <w:p/>
     <w:p>
@@ -2101,13 +1617,8 @@
     <w:p/>
     <w:p>
       <w:r>
-        <w:t xml:space="preserve">*(Same as baseline Tab </w:t>
-      </w:r>
-      <w:proofErr w:type="gramStart"/>
-      <w:r>
-        <w:t>10)*</w:t>
-      </w:r>
-      <w:proofErr w:type="gramEnd"/>
+        <w:t>*(Same as baseline Tab 10)*</w:t>
+      </w:r>
     </w:p>
     <w:p/>
     <w:p>
@@ -2210,28 +1721,805 @@
       </w:r>
     </w:p>
     <w:p/>
+    <w:p/>
+    <w:p/>
+    <w:p/>
+    <w:p>
+      <w:r>
+        <w:t>Shall we proceed with implementing any of these? If so, I'd suggest starting with **Litigation Funding** since the engine already produces the `</w:t>
+      </w:r>
+      <w:proofErr w:type="spellStart"/>
+      <w:r>
+        <w:t>waterfall_grid</w:t>
+      </w:r>
+      <w:proofErr w:type="spellEnd"/>
+      <w:r>
+        <w:t>`, `sensitivity`, and `</w:t>
+      </w:r>
+      <w:proofErr w:type="spellStart"/>
+      <w:r>
+        <w:t>jcurve_data</w:t>
+      </w:r>
+      <w:proofErr w:type="spellEnd"/>
+      <w:r>
+        <w:t>` outputs, so we can wire the dashboard directly to real data.</w:t>
+      </w:r>
+    </w:p>
+    <w:p/>
+    <w:p/>
+    <w:p/>
+    <w:p>
+      <w:r>
+        <w:t>**Objective:** Ensure the results dashboard for the staged milestone payments structure correctly renders all tabs, charts, KPIs, and data with no hardcoded values, no broken components, and accurate simulation outputs.</w:t>
+      </w:r>
+    </w:p>
+    <w:p/>
+    <w:p>
+      <w:r>
+        <w:t>**Current State:**</w:t>
+      </w:r>
+    </w:p>
+    <w:p>
+      <w:r>
+        <w:t>- Structure handler exists: `engine/structures/monetisation_staged.py` → `</w:t>
+      </w:r>
+      <w:proofErr w:type="spellStart"/>
+      <w:r>
+        <w:t>StagedHandler</w:t>
+      </w:r>
+      <w:proofErr w:type="spellEnd"/>
+      <w:r>
+        <w:t>`</w:t>
+      </w:r>
+    </w:p>
+    <w:p>
+      <w:r>
+        <w:t>- Dashboard has structure-specific components: `</w:t>
+      </w:r>
+      <w:proofErr w:type="spellStart"/>
+      <w:r>
+        <w:t>MilestoneAnalysis.jsx</w:t>
+      </w:r>
+      <w:proofErr w:type="spellEnd"/>
+      <w:r>
+        <w:t>`, `</w:t>
+      </w:r>
+      <w:proofErr w:type="spellStart"/>
+      <w:r>
+        <w:t>StagedKPIs.jsx</w:t>
+      </w:r>
+      <w:proofErr w:type="spellEnd"/>
+      <w:r>
+        <w:t>`</w:t>
+      </w:r>
+    </w:p>
+    <w:p>
+      <w:r>
+        <w:t xml:space="preserve">- Dashboard </w:t>
+      </w:r>
+      <w:proofErr w:type="spellStart"/>
+      <w:r>
+        <w:t>App.jsx</w:t>
+      </w:r>
+      <w:proofErr w:type="spellEnd"/>
+      <w:r>
+        <w:t xml:space="preserve"> shows structure-specific tabs based on `</w:t>
+      </w:r>
+      <w:proofErr w:type="spellStart"/>
+      <w:r>
+        <w:t>structure_type</w:t>
+      </w:r>
+      <w:proofErr w:type="spellEnd"/>
+      <w:r>
+        <w:t>`</w:t>
+      </w:r>
+    </w:p>
+    <w:p>
+      <w:r>
+        <w:t>- Potential issues: hardcoded TATA references, untested edge cases, missing data fields</w:t>
+      </w:r>
+    </w:p>
+    <w:p/>
+    <w:p>
+      <w:r>
+        <w:t>**Validation Checklist:**</w:t>
+      </w:r>
+    </w:p>
+    <w:p/>
+    <w:p>
+      <w:r>
+        <w:t>1. **Engine Output Verification**</w:t>
+      </w:r>
+    </w:p>
+    <w:p>
+      <w:r>
+        <w:t xml:space="preserve">   - Run staged milestone simulation: `python -m engine.run_v2 --config &lt;</w:t>
+      </w:r>
+      <w:proofErr w:type="spellStart"/>
+      <w:r>
+        <w:t>staged_config</w:t>
+      </w:r>
+      <w:proofErr w:type="spellEnd"/>
+      <w:r>
+        <w:t>&gt; --output-</w:t>
+      </w:r>
+      <w:proofErr w:type="spellStart"/>
+      <w:r>
+        <w:t>dir</w:t>
+      </w:r>
+      <w:proofErr w:type="spellEnd"/>
+      <w:r>
+        <w:t xml:space="preserve"> </w:t>
+      </w:r>
+      <w:proofErr w:type="spellStart"/>
+      <w:r>
+        <w:t>test_outputs</w:t>
+      </w:r>
+      <w:proofErr w:type="spellEnd"/>
+      <w:r>
+        <w:t>/</w:t>
+      </w:r>
+      <w:proofErr w:type="spellStart"/>
+      <w:r>
+        <w:t>staged_test</w:t>
+      </w:r>
+      <w:proofErr w:type="spellEnd"/>
+      <w:r>
+        <w:t xml:space="preserve"> --n 1000`</w:t>
+      </w:r>
+    </w:p>
+    <w:p>
+      <w:r>
+        <w:t xml:space="preserve">   - Verify `</w:t>
+      </w:r>
+      <w:proofErr w:type="spellStart"/>
+      <w:r>
+        <w:t>dashboard_data.json</w:t>
+      </w:r>
+      <w:proofErr w:type="spellEnd"/>
+      <w:r>
+        <w:t>` contains all required keys for staged structure</w:t>
+      </w:r>
+    </w:p>
+    <w:p>
+      <w:r>
+        <w:t xml:space="preserve">   - Verify milestone-specific fields: milestone payment schedule, draw-down timing, staged IRR/MOIC</w:t>
+      </w:r>
+    </w:p>
+    <w:p>
+      <w:r>
+        <w:t xml:space="preserve">   - Confirm no </w:t>
+      </w:r>
+      <w:proofErr w:type="spellStart"/>
+      <w:r>
+        <w:t>NaN</w:t>
+      </w:r>
+      <w:proofErr w:type="spellEnd"/>
+      <w:r>
+        <w:t>, null, or missing values in output</w:t>
+      </w:r>
+    </w:p>
+    <w:p/>
     <w:p>
       <w:r>
         <w:lastRenderedPageBreak/>
-        <w:t>Shall we proceed with implementing any of these? If so, I'd suggest starting with **Litigation Funding** since the engine already produces the `</w:t>
-      </w:r>
-      <w:proofErr w:type="spellStart"/>
-      <w:r>
-        <w:t>waterfall_grid</w:t>
-      </w:r>
-      <w:proofErr w:type="spellEnd"/>
-      <w:r>
-        <w:t>`, `sensitivity`, and `</w:t>
-      </w:r>
-      <w:proofErr w:type="spellStart"/>
-      <w:r>
-        <w:t>jcurve_data</w:t>
-      </w:r>
-      <w:proofErr w:type="spellEnd"/>
-      <w:r>
-        <w:t>` outputs, so we can wire the dashboard directly to real data.</w:t>
-      </w:r>
-    </w:p>
+        <w:t>2. **Dashboard Tab Verification — MONETISATION: STAGED MILESTONE PAYMENTS (11 Tabs)**</w:t>
+      </w:r>
+    </w:p>
+    <w:p/>
+    <w:p>
+      <w:r>
+        <w:t xml:space="preserve">   **Tab 1 — Executive Summary**</w:t>
+      </w:r>
+    </w:p>
+    <w:p>
+      <w:r>
+        <w:t xml:space="preserve">   | Output | Description |</w:t>
+      </w:r>
+    </w:p>
+    <w:p>
+      <w:r>
+        <w:t xml:space="preserve">   |--------|-------------|</w:t>
+      </w:r>
+    </w:p>
+    <w:p>
+      <w:r>
+        <w:t xml:space="preserve">   | Portfolio Overview | Structure type, number of claims, jurisdiction breakdown |</w:t>
+      </w:r>
+    </w:p>
+    <w:p>
+      <w:r>
+        <w:t xml:space="preserve">   | Headline KPIs | Expected Portfolio MOIC, Expected Portfolio IRR, Total Investment Required, Expected Weighted Award, Probability of Overall Profit |</w:t>
+      </w:r>
+    </w:p>
+    <w:p>
+      <w:r>
+        <w:t xml:space="preserve">   | Milestone Schedule Summary | Number of milestone stages, total committed capital, draw-down timeline |</w:t>
+      </w:r>
+    </w:p>
+    <w:p>
+      <w:r>
+        <w:t xml:space="preserve">   | Risk Summary | Probability of total loss, downside MOIC (5th percentile), upside MOIC (95th percentile) |</w:t>
+      </w:r>
+    </w:p>
+    <w:p/>
+    <w:p>
+      <w:r>
+        <w:t xml:space="preserve">   **Tab 2 — Milestone Analysis** (`</w:t>
+      </w:r>
+      <w:proofErr w:type="spellStart"/>
+      <w:r>
+        <w:t>MilestoneAnalysis.jsx</w:t>
+      </w:r>
+      <w:proofErr w:type="spellEnd"/>
+      <w:r>
+        <w:t>`)</w:t>
+      </w:r>
+    </w:p>
+    <w:p>
+      <w:r>
+        <w:t xml:space="preserve">   | Output | Description |</w:t>
+      </w:r>
+    </w:p>
+    <w:p>
+      <w:r>
+        <w:t xml:space="preserve">   |--------|-------------|</w:t>
+      </w:r>
+    </w:p>
+    <w:p>
+      <w:r>
+        <w:t xml:space="preserve">   | Milestone Payment Schedule | Table: milestone #, trigger event, payment amount, cumulative invested, expected timing |</w:t>
+      </w:r>
+    </w:p>
+    <w:p>
+      <w:r>
+        <w:t xml:space="preserve">   | Milestone Draw-Down Chart | Bar/area chart showing capital deployment over time per milestone |</w:t>
+      </w:r>
+    </w:p>
+    <w:p>
+      <w:r>
+        <w:t xml:space="preserve">   | Scenario Comparison | Expected / Base / Stress milestone outcomes with IRR and MOIC for each |</w:t>
+      </w:r>
+    </w:p>
+    <w:p>
+      <w:r>
+        <w:t xml:space="preserve">   | Milestone Risk Matrix | Probability of reaching each milestone stage, conditional returns |</w:t>
+      </w:r>
+    </w:p>
+    <w:p/>
+    <w:p>
+      <w:r>
+        <w:t xml:space="preserve">   **Tab 3 — Probability Outcomes** (`</w:t>
+      </w:r>
+      <w:proofErr w:type="spellStart"/>
+      <w:r>
+        <w:t>ProbabilityOutcomes.jsx</w:t>
+      </w:r>
+      <w:proofErr w:type="spellEnd"/>
+      <w:r>
+        <w:t>`)</w:t>
+      </w:r>
+    </w:p>
+    <w:p>
+      <w:r>
+        <w:t xml:space="preserve">   | Output | Description |</w:t>
+      </w:r>
+    </w:p>
+    <w:p>
+      <w:r>
+        <w:t xml:space="preserve">   |--------|-------------|</w:t>
+      </w:r>
+    </w:p>
+    <w:p>
+      <w:r>
+        <w:t xml:space="preserve">   | Probability Tree | Interactive tree showing jurisdiction-specific challenge paths with probabilities at each node |</w:t>
+      </w:r>
+    </w:p>
+    <w:p>
+      <w:r>
+        <w:lastRenderedPageBreak/>
+        <w:t xml:space="preserve">   | Scenario Paths Table | All terminal scenarios with: path description, cumulative probability, expected award, MOIC, IRR |</w:t>
+      </w:r>
+    </w:p>
+    <w:p>
+      <w:r>
+        <w:t xml:space="preserve">   | Probability Sensitivity | Tornado chart showing which probability nodes have the greatest impact on portfolio MOIC |</w:t>
+      </w:r>
+    </w:p>
+    <w:p>
+      <w:r>
+        <w:t xml:space="preserve">   | Outcome Distribution | Histogram of MOIC outcomes across all Monte Carlo iterations |</w:t>
+      </w:r>
+    </w:p>
+    <w:p/>
+    <w:p>
+      <w:r>
+        <w:t xml:space="preserve">   **Tab 4 — Quantum &amp; Timeline** (`</w:t>
+      </w:r>
+      <w:proofErr w:type="spellStart"/>
+      <w:r>
+        <w:t>QuantumTimeline.jsx</w:t>
+      </w:r>
+      <w:proofErr w:type="spellEnd"/>
+      <w:r>
+        <w:t>`)</w:t>
+      </w:r>
+    </w:p>
+    <w:p>
+      <w:r>
+        <w:t xml:space="preserve">   | Output | Description |</w:t>
+      </w:r>
+    </w:p>
+    <w:p>
+      <w:r>
+        <w:t xml:space="preserve">   |--------|-------------|</w:t>
+      </w:r>
+    </w:p>
+    <w:p>
+      <w:r>
+        <w:t xml:space="preserve">   | Quantum Band Distribution | Table/chart of quantum bands with probabilities and expected award values |</w:t>
+      </w:r>
+    </w:p>
+    <w:p>
+      <w:r>
+        <w:t xml:space="preserve">   | Timeline Distribution | Histogram of case duration outcomes (years) |</w:t>
+      </w:r>
+    </w:p>
+    <w:p>
+      <w:r>
+        <w:t xml:space="preserve">   | Expected Timeline by Scenario | Table: scenario path, expected duration, milestone timing impact |</w:t>
+      </w:r>
+    </w:p>
+    <w:p>
+      <w:r>
+        <w:t xml:space="preserve">   | Interest Accumulation | Pre-award and post-award interest rates applied, total interest impact on quantum |</w:t>
+      </w:r>
+    </w:p>
+    <w:p/>
+    <w:p>
+      <w:r>
+        <w:t xml:space="preserve">   **Tab 5 — Investment Analysis** (`</w:t>
+      </w:r>
+      <w:proofErr w:type="spellStart"/>
+      <w:r>
+        <w:t>InvestmentSOC.jsx</w:t>
+      </w:r>
+      <w:proofErr w:type="spellEnd"/>
+      <w:r>
+        <w:t>`)</w:t>
+      </w:r>
+    </w:p>
+    <w:p>
+      <w:r>
+        <w:t xml:space="preserve">   | Output | Description |</w:t>
+      </w:r>
+    </w:p>
+    <w:p>
+      <w:r>
+        <w:t xml:space="preserve">   |--------|-------------|</w:t>
+      </w:r>
+    </w:p>
+    <w:p>
+      <w:r>
+        <w:t xml:space="preserve">   | Investment Grid | Sensitivity grid: milestone schedule configurations vs. expected MOIC/IRR |</w:t>
+      </w:r>
+    </w:p>
+    <w:p>
+      <w:r>
+        <w:t xml:space="preserve">   | Breakeven Analysis | Minimum win probability required for breakeven at each milestone configuration |</w:t>
+      </w:r>
+    </w:p>
+    <w:p>
+      <w:r>
+        <w:t xml:space="preserve">   | Capital Deployment Timeline | Chart showing staged capital deployment vs. cumulative exposure |</w:t>
+      </w:r>
+    </w:p>
+    <w:p>
+      <w:r>
+        <w:t xml:space="preserve">   | Return Waterfall | Waterfall chart: invested capital, milestone payments, award recovery, net return |</w:t>
+      </w:r>
+    </w:p>
+    <w:p/>
+    <w:p>
+      <w:r>
+        <w:t xml:space="preserve">   **Tab 6 — Per-Claim Analysis** (`</w:t>
+      </w:r>
+      <w:proofErr w:type="spellStart"/>
+      <w:r>
+        <w:t>PerClaimContribution.jsx</w:t>
+      </w:r>
+      <w:proofErr w:type="spellEnd"/>
+      <w:r>
+        <w:t>`)</w:t>
+      </w:r>
+    </w:p>
+    <w:p>
+      <w:r>
+        <w:lastRenderedPageBreak/>
+        <w:t xml:space="preserve">   | Output | Description |</w:t>
+      </w:r>
+    </w:p>
+    <w:p>
+      <w:r>
+        <w:t xml:space="preserve">   |--------|-------------|</w:t>
+      </w:r>
+    </w:p>
+    <w:p>
+      <w:r>
+        <w:t xml:space="preserve">   | Claim Contribution Table | Each claim: name, jurisdiction, claim value, expected award, contribution to portfolio MOIC, weight |</w:t>
+      </w:r>
+    </w:p>
+    <w:p>
+      <w:r>
+        <w:t xml:space="preserve">   | Per-Claim Milestone Breakdown | How each claim milestone schedule contributes to overall draw-down |</w:t>
+      </w:r>
+    </w:p>
+    <w:p>
+      <w:r>
+        <w:t xml:space="preserve">   | Claim Risk Ranking | Claims ranked by risk-adjusted return contribution |</w:t>
+      </w:r>
+    </w:p>
+    <w:p/>
+    <w:p>
+      <w:r>
+        <w:t xml:space="preserve">   **Tab 7 — Legal Costs** (`</w:t>
+      </w:r>
+      <w:proofErr w:type="spellStart"/>
+      <w:r>
+        <w:t>LegalCosts.jsx</w:t>
+      </w:r>
+      <w:proofErr w:type="spellEnd"/>
+      <w:r>
+        <w:t>`)</w:t>
+      </w:r>
+    </w:p>
+    <w:p>
+      <w:r>
+        <w:t xml:space="preserve">   | Output | Description |</w:t>
+      </w:r>
+    </w:p>
+    <w:p>
+      <w:r>
+        <w:t xml:space="preserve">   |--------|-------------|</w:t>
+      </w:r>
+    </w:p>
+    <w:p>
+      <w:r>
+        <w:t xml:space="preserve">   | Legal Cost Breakdown | Table: cost stage, amount, timing, cumulative legal spend |</w:t>
+      </w:r>
+    </w:p>
+    <w:p>
+      <w:r>
+        <w:t xml:space="preserve">   | Cost vs. Award Ratio | Legal costs as percentage of expected award per claim |</w:t>
+      </w:r>
+    </w:p>
+    <w:p>
+      <w:r>
+        <w:t xml:space="preserve">   | Cost Sensitivity | Impact of legal cost overruns on portfolio IRR and MOIC |</w:t>
+      </w:r>
+    </w:p>
+    <w:p/>
+    <w:p>
+      <w:r>
+        <w:t xml:space="preserve">   **Tab 8 — Cashflow &amp; Waterfall** (`</w:t>
+      </w:r>
+      <w:proofErr w:type="spellStart"/>
+      <w:r>
+        <w:t>ClaimCashflow.jsx</w:t>
+      </w:r>
+      <w:proofErr w:type="spellEnd"/>
+      <w:r>
+        <w:t>`)</w:t>
+      </w:r>
+    </w:p>
+    <w:p>
+      <w:r>
+        <w:t xml:space="preserve">   | Output | Description |</w:t>
+      </w:r>
+    </w:p>
+    <w:p>
+      <w:r>
+        <w:t xml:space="preserve">   |--------|-------------|</w:t>
+      </w:r>
+    </w:p>
+    <w:p>
+      <w:r>
+        <w:t xml:space="preserve">   | Cashflow Timeline | Time-series chart: milestone outflows, legal cost outflows, award inflows |</w:t>
+      </w:r>
+    </w:p>
+    <w:p>
+      <w:r>
+        <w:t xml:space="preserve">   | J-Curve Visualisation | Cumulative cashflow chart showing capital deployment trough and recovery |</w:t>
+      </w:r>
+    </w:p>
+    <w:p>
+      <w:r>
+        <w:t xml:space="preserve">   | Net Cashflow Table | Period-by-period breakdown: outflows, inflows, net, cumulative |</w:t>
+      </w:r>
+    </w:p>
+    <w:p>
+      <w:r>
+        <w:t xml:space="preserve">   | Waterfall Chart | Priority of payments: milestone recovery, legal cost recovery, profit split |</w:t>
+      </w:r>
+    </w:p>
+    <w:p/>
+    <w:p>
+      <w:r>
+        <w:t xml:space="preserve">   **Tab 9 — Stochastic Pricing** (`</w:t>
+      </w:r>
+      <w:proofErr w:type="spellStart"/>
+      <w:r>
+        <w:t>StochasticPricing.jsx</w:t>
+      </w:r>
+      <w:proofErr w:type="spellEnd"/>
+      <w:r>
+        <w:t>`)</w:t>
+      </w:r>
+    </w:p>
+    <w:p>
+      <w:r>
+        <w:t xml:space="preserve">   | Output | Description |</w:t>
+      </w:r>
+    </w:p>
+    <w:p>
+      <w:r>
+        <w:t xml:space="preserve">   |--------|-------------|</w:t>
+      </w:r>
+    </w:p>
+    <w:p>
+      <w:r>
+        <w:lastRenderedPageBreak/>
+        <w:t xml:space="preserve">   | Monte Carlo Distribution | Histogram of portfolio returns across n iterations |</w:t>
+      </w:r>
+    </w:p>
+    <w:p>
+      <w:r>
+        <w:t xml:space="preserve">   | Confidence Intervals | Table: 5th, 25th, 50th, 75th, 95th percentile MOIC and IRR |</w:t>
+      </w:r>
+    </w:p>
+    <w:p>
+      <w:r>
+        <w:t xml:space="preserve">   | </w:t>
+      </w:r>
+      <w:proofErr w:type="spellStart"/>
+      <w:r>
+        <w:t>VaR</w:t>
+      </w:r>
+      <w:proofErr w:type="spellEnd"/>
+      <w:r>
+        <w:t xml:space="preserve"> Analysis | Value at Risk at 95% and 99% confidence levels |</w:t>
+      </w:r>
+    </w:p>
+    <w:p>
+      <w:r>
+        <w:t xml:space="preserve">   | Pricing Range | Suggested milestone pricing range based on target return thresholds |</w:t>
+      </w:r>
+    </w:p>
+    <w:p/>
+    <w:p>
+      <w:r>
+        <w:t xml:space="preserve">   **Tab 10 — Pricing Surface** (`</w:t>
+      </w:r>
+      <w:proofErr w:type="spellStart"/>
+      <w:r>
+        <w:t>PricingSurface.jsx</w:t>
+      </w:r>
+      <w:proofErr w:type="spellEnd"/>
+      <w:r>
+        <w:t>`)</w:t>
+      </w:r>
+    </w:p>
+    <w:p>
+      <w:r>
+        <w:t xml:space="preserve">   | Output | Description |</w:t>
+      </w:r>
+    </w:p>
+    <w:p>
+      <w:r>
+        <w:t xml:space="preserve">   |--------|-------------|</w:t>
+      </w:r>
+    </w:p>
+    <w:p>
+      <w:r>
+        <w:t xml:space="preserve">   | 3D/Heatmap Surface | Milestone schedule (x-axis) vs. win probability (y-axis) vs. expected MOIC (z-axis/colour) |</w:t>
+      </w:r>
+    </w:p>
+    <w:p>
+      <w:r>
+        <w:t xml:space="preserve">   | Breakeven Contour | Contour line showing MOIC = 1.0x boundary |</w:t>
+      </w:r>
+    </w:p>
+    <w:p>
+      <w:r>
+        <w:t xml:space="preserve">   | Optimal Pricing Point | Highlighted optimal milestone configuration for target MOIC |</w:t>
+      </w:r>
+    </w:p>
+    <w:p/>
+    <w:p>
+      <w:r>
+        <w:t xml:space="preserve">   **Tab 11 — Report Charts** (`</w:t>
+      </w:r>
+      <w:proofErr w:type="spellStart"/>
+      <w:r>
+        <w:t>ReportCharts.jsx</w:t>
+      </w:r>
+      <w:proofErr w:type="spellEnd"/>
+      <w:r>
+        <w:t>`)</w:t>
+      </w:r>
+    </w:p>
+    <w:p>
+      <w:r>
+        <w:t xml:space="preserve">   | Output | Description |</w:t>
+      </w:r>
+    </w:p>
+    <w:p>
+      <w:r>
+        <w:t xml:space="preserve">   |--------|-------------|</w:t>
+      </w:r>
+    </w:p>
+    <w:p>
+      <w:r>
+        <w:t xml:space="preserve">   | Exportable Chart Pack | All key charts formatted for PDF/presentation export |</w:t>
+      </w:r>
+    </w:p>
+    <w:p>
+      <w:r>
+        <w:t xml:space="preserve">   | Summary Dashboard | Compact single-page view with headline KPIs and key charts |</w:t>
+      </w:r>
+    </w:p>
+    <w:p/>
+    <w:p>
+      <w:r>
+        <w:t>3. **Data Binding Audit**</w:t>
+      </w:r>
+    </w:p>
+    <w:p>
+      <w:r>
+        <w:t xml:space="preserve">   - Ensure all KPIs read from `</w:t>
+      </w:r>
+      <w:proofErr w:type="spellStart"/>
+      <w:r>
+        <w:t>dashboard_data.json</w:t>
+      </w:r>
+      <w:proofErr w:type="spellEnd"/>
+      <w:r>
+        <w:t>` dynamically (no hardcoded numbers)</w:t>
+      </w:r>
+    </w:p>
+    <w:p>
+      <w:r>
+        <w:t xml:space="preserve">   - Verify milestone payment amounts come from simulation, not defaults</w:t>
+      </w:r>
+    </w:p>
+    <w:p>
+      <w:r>
+        <w:t xml:space="preserve">   - Check that `</w:t>
+      </w:r>
+      <w:proofErr w:type="spellStart"/>
+      <w:r>
+        <w:t>StagedKPIs.jsx</w:t>
+      </w:r>
+      <w:proofErr w:type="spellEnd"/>
+      <w:r>
+        <w:t>` correctly maps data from the staged handler output</w:t>
+      </w:r>
+    </w:p>
+    <w:p>
+      <w:r>
+        <w:t xml:space="preserve">   - Verify all 11 tabs render with no missing data keys or undefined values</w:t>
+      </w:r>
+    </w:p>
+    <w:p/>
+    <w:p>
+      <w:r>
+        <w:t>4. **Edge Cases**</w:t>
+      </w:r>
+    </w:p>
+    <w:p>
+      <w:r>
+        <w:t xml:space="preserve">   - Run with 1 claim, 5 claims, 20 claims</w:t>
+      </w:r>
+    </w:p>
+    <w:p>
+      <w:r>
+        <w:t xml:space="preserve">   - Run with extreme milestone values (very small, very large)</w:t>
+      </w:r>
+    </w:p>
+    <w:p>
+      <w:r>
+        <w:lastRenderedPageBreak/>
+        <w:t xml:space="preserve">   - Run with 0% probability scenarios</w:t>
+      </w:r>
+    </w:p>
+    <w:p>
+      <w:r>
+        <w:t xml:space="preserve">   - Verify error boundaries catch rendering failures gracefully</w:t>
+      </w:r>
+    </w:p>
+    <w:p/>
+    <w:p>
+      <w:r>
+        <w:t>**Acceptance Criteria:**</w:t>
+      </w:r>
+    </w:p>
+    <w:p>
+      <w:r>
+        <w:t>- [ ] Staged milestone simulation runs end-to-end without errors (n=1000)</w:t>
+      </w:r>
+    </w:p>
+    <w:p>
+      <w:r>
+        <w:t>- [ ] All 11 dashboard tabs render correctly for staged structure</w:t>
+      </w:r>
+    </w:p>
+    <w:p>
+      <w:r>
+        <w:t xml:space="preserve">- [ ] </w:t>
+      </w:r>
+      <w:proofErr w:type="spellStart"/>
+      <w:r>
+        <w:t>MilestoneAnalysis.jsx</w:t>
+      </w:r>
+      <w:proofErr w:type="spellEnd"/>
+      <w:r>
+        <w:t xml:space="preserve"> displays dynamic milestone schedule and scenarios</w:t>
+      </w:r>
+    </w:p>
+    <w:p>
+      <w:r>
+        <w:t xml:space="preserve">- [ ] </w:t>
+      </w:r>
+      <w:proofErr w:type="spellStart"/>
+      <w:r>
+        <w:t>StagedKPIs.jsx</w:t>
+      </w:r>
+      <w:proofErr w:type="spellEnd"/>
+      <w:r>
+        <w:t xml:space="preserve"> shows accurate staged-specific KPIs</w:t>
+      </w:r>
+    </w:p>
+    <w:p>
+      <w:r>
+        <w:t>- [ ] Stochastic Pricing tab shows Monte Carlo distribution and confidence intervals</w:t>
+      </w:r>
+    </w:p>
+    <w:p>
+      <w:r>
+        <w:t>- [ ] Pricing Surface tab renders 3D/heatmap surface correctly</w:t>
+      </w:r>
+    </w:p>
+    <w:p>
+      <w:r>
+        <w:t>- [ ] No hardcoded TATA references in staged-specific components</w:t>
+      </w:r>
+    </w:p>
+    <w:p>
+      <w:r>
+        <w:t>- [ ] Edge cases handled (empty results, extreme values)</w:t>
+      </w:r>
+    </w:p>
+    <w:p>
+      <w:r>
+        <w:t>- [ ] Screenshot evidence of all 11 tabs for QA</w:t>
+      </w:r>
+    </w:p>
+    <w:p/>
+    <w:p/>
+    <w:p/>
+    <w:p/>
+    <w:p/>
+    <w:p/>
+    <w:p/>
+    <w:p/>
+    <w:p/>
+    <w:p/>
+    <w:p/>
+    <w:p/>
+    <w:p/>
+    <w:p/>
+    <w:p/>
+    <w:p/>
     <w:sectPr>
       <w:pgSz w:w="11906" w:h="16838"/>
       <w:pgMar w:top="1440" w:right="1440" w:bottom="1440" w:left="1440" w:header="708" w:footer="708" w:gutter="0"/>

</xml_diff>

<commit_message>
feat: jurisdiction-specific legal stages with known outcomes
- Add KnownOutcomes Pydantic model with 14 outcome fields
- Expand available_stages to 12-13 per jurisdiction (incl. post-award)
- MC engine forces arb_won when outcome is known (fixes 30%% error rate bug)
- Known quantum uses TruncatedNormal distribution centered on known amount
- Partial challenge tree traversal for decided court stages
- Enforcement stage bypasses MC pipeline
- Frontend: conditional outcome fields, HKIAC support, HKD currency
- Dashboard: updated stage labels for all jurisdictions
- 51 new integration tests (test_known_outcomes.py), 234 total tests pass
- Documentation: METHODOLOGY, AGENT_CONTEXT_GUIDE, PLAYBOOK updated
</commit_message>
<xml_diff>
--- a/Dashboard Design- Per Portfolio Structure.docx
+++ b/Dashboard Design- Per Portfolio Structure.docx
@@ -37,7 +37,15 @@
     <w:p/>
     <w:p>
       <w:r>
-        <w:t>&gt; **Core investor question:** "I'm funding legal costs in exchange for a capped share of the award. What cost-multiple and award-ratio caps maximise my risk-adjusted return?"</w:t>
+        <w:t xml:space="preserve">&gt; **Core investor </w:t>
+      </w:r>
+      <w:proofErr w:type="gramStart"/>
+      <w:r>
+        <w:t>question:*</w:t>
+      </w:r>
+      <w:proofErr w:type="gramEnd"/>
+      <w:r>
+        <w:t>* "I'm funding legal costs in exchange for a capped share of the award. What cost-multiple and award-ratio caps maximise my risk-adjusted return?"</w:t>
       </w:r>
     </w:p>
     <w:p/>
@@ -59,7 +67,15 @@
     </w:p>
     <w:p>
       <w:r>
-        <w:t>| 1 | **Funding Economics Overview** | Expandable formula card | Fund Return = min(Cost Multiple × Legal Costs, Award Ratio × Collected Award). Shows portfolio-level arithmetic with expansion per claim |</w:t>
+        <w:t xml:space="preserve">| 1 | **Funding Economics Overview** | Expandable formula card | Fund Return = </w:t>
+      </w:r>
+      <w:proofErr w:type="gramStart"/>
+      <w:r>
+        <w:t>min(</w:t>
+      </w:r>
+      <w:proofErr w:type="gramEnd"/>
+      <w:r>
+        <w:t>Cost Multiple × Legal Costs, Award Ratio × Collected Award). Shows portfolio-level arithmetic with expansion per claim |</w:t>
       </w:r>
     </w:p>
     <w:p>
@@ -72,7 +88,15 @@
       </w:r>
       <w:proofErr w:type="spellEnd"/>
       <w:r>
-        <w:t xml:space="preserve"> Win Rate, Total E[Legal Costs] (= Investment), E[Collected], E[Fund Return], E[Net Profit] |</w:t>
+        <w:t xml:space="preserve"> Win Rate, Total </w:t>
+      </w:r>
+      <w:proofErr w:type="gramStart"/>
+      <w:r>
+        <w:t>E[</w:t>
+      </w:r>
+      <w:proofErr w:type="gramEnd"/>
+      <w:r>
+        <w:t>Legal Costs] (= Investment), E[Collected], E[Fund Return], E[Net Profit] |</w:t>
       </w:r>
     </w:p>
     <w:p>
@@ -95,28 +119,68 @@
     </w:p>
     <w:p>
       <w:r>
-        <w:t>| 5 | **J-Curve Fan Chart** | Multi-line fan (P10–P90) | Cumulative net cashflow over 96 months. Shows initial legal-cost burn tapering into recovery payouts |</w:t>
+        <w:t xml:space="preserve">| 5 | **J-Curve Fan Chart** | </w:t>
+      </w:r>
+      <w:proofErr w:type="gramStart"/>
+      <w:r>
+        <w:t>Multi-line</w:t>
+      </w:r>
+      <w:proofErr w:type="gramEnd"/>
+      <w:r>
+        <w:t xml:space="preserve"> fan (P10–P90) | Cumulative net cashflow over 96 months. Shows initial legal-cost burn tapering into recovery payouts |</w:t>
       </w:r>
     </w:p>
     <w:p>
       <w:r>
         <w:lastRenderedPageBreak/>
-        <w:t>| 6 | **Claim Overview Cards** | Grid of cards | Per-claim: SOC, Win Rate, E[Legal Cost], E[Duration], Jurisdiction, viability badge, outcome bar (Win/Restart/Lose %) |</w:t>
-      </w:r>
-    </w:p>
-    <w:p>
-      <w:r>
-        <w:t>| 7 | **Return Distribution** | Histogram + dropdowns | MC outcome distribution of portfolio MOIC. Dropdowns: Cost Multiple cap, Award Ratio cap |</w:t>
-      </w:r>
-    </w:p>
-    <w:p>
-      <w:r>
-        <w:t>| 8 | **Funding Scenario Summary** | HTML table + dropdown | Rows: cost multiples. Columns: Investment (= legal costs), E[MOIC], E[IRR], P(Loss), E[Net Return], P(Hurdle). Dropdown for Award Ratio. Color-coded |</w:t>
-      </w:r>
-    </w:p>
-    <w:p>
-      <w:r>
-        <w:t>| 9 | **Cross-Claim Comparison: IRR &amp; MOIC** | Dual-axis bar chart | X: Claim ID. Left Y: E[MOIC] (bars). Right Y: E[IRR] (bars). Dropdowns for Cost Multiple and Award Ratio |</w:t>
+        <w:t xml:space="preserve">| 6 | **Claim Overview Cards** | Grid of cards | Per-claim: SOC, Win Rate, </w:t>
+      </w:r>
+      <w:proofErr w:type="gramStart"/>
+      <w:r>
+        <w:t>E[</w:t>
+      </w:r>
+      <w:proofErr w:type="gramEnd"/>
+      <w:r>
+        <w:t>Legal Cost], E[Duration], Jurisdiction, viability badge, outcome bar (Win/Restart/Lose %) |</w:t>
+      </w:r>
+    </w:p>
+    <w:p>
+      <w:r>
+        <w:t xml:space="preserve">| 7 | **Return Distribution** | Histogram + dropdowns | MC outcome distribution of portfolio MOIC. Dropdowns: Cost Multiple </w:t>
+      </w:r>
+      <w:proofErr w:type="gramStart"/>
+      <w:r>
+        <w:t>cap</w:t>
+      </w:r>
+      <w:proofErr w:type="gramEnd"/>
+      <w:r>
+        <w:t>, Award Ratio cap |</w:t>
+      </w:r>
+    </w:p>
+    <w:p>
+      <w:r>
+        <w:t xml:space="preserve">| 8 | **Funding Scenario Summary** | HTML table + dropdown | Rows: cost multiples. Columns: Investment (= legal costs), E[MOIC], E[IRR], P(Loss), </w:t>
+      </w:r>
+      <w:proofErr w:type="gramStart"/>
+      <w:r>
+        <w:t>E[</w:t>
+      </w:r>
+      <w:proofErr w:type="gramEnd"/>
+      <w:r>
+        <w:t>Net Return], P(Hurdle). Dropdown for Award Ratio. Color-coded |</w:t>
+      </w:r>
+    </w:p>
+    <w:p>
+      <w:r>
+        <w:t>| 9 | **</w:t>
+      </w:r>
+      <w:proofErr w:type="gramStart"/>
+      <w:r>
+        <w:t>Cross-Claim</w:t>
+      </w:r>
+      <w:proofErr w:type="gramEnd"/>
+      <w:r>
+        <w:t xml:space="preserve"> Comparison: IRR &amp; MOIC** | Dual-axis bar chart | X: Claim ID. Left Y: E[MOIC] (bars). Right Y: E[IRR] (bars). Dropdowns for Cost Multiple and Award Ratio |</w:t>
       </w:r>
     </w:p>
     <w:p/>
@@ -138,7 +202,15 @@
     </w:p>
     <w:p>
       <w:r>
-        <w:t>| 1 | **Input Probability Parameters** | 4-KPI row | P(Arb Win), P(Re-Arb Win), E[Q\|Win], MC Paths |</w:t>
+        <w:t xml:space="preserve">| 1 | **Input Probability Parameters** | 4-KPI row | </w:t>
+      </w:r>
+      <w:proofErr w:type="gramStart"/>
+      <w:r>
+        <w:t>P(</w:t>
+      </w:r>
+      <w:proofErr w:type="gramEnd"/>
+      <w:r>
+        <w:t>Arb Win), P(Re-Arb Win), E[Q\|Win], MC Paths |</w:t>
       </w:r>
     </w:p>
     <w:p>
@@ -184,7 +256,15 @@
     <w:p>
       <w:r>
         <w:lastRenderedPageBreak/>
-        <w:t>| 10 | **Arb-Win Sensitivity Analysis** | Tornado / line chart | **Unique to Lit Funding**: uses the `sensitivity` data. X: P(Arb Win) (0.1–0.9). Lines: E[MOIC], E[IRR], P(Loss). Shows how sensitive fund returns are to arbitration win probability |</w:t>
+        <w:t xml:space="preserve">| 10 | **Arb-Win Sensitivity Analysis** | Tornado / line chart | **Unique to Lit Funding**: uses the `sensitivity` data. X: </w:t>
+      </w:r>
+      <w:proofErr w:type="gramStart"/>
+      <w:r>
+        <w:t>P(</w:t>
+      </w:r>
+      <w:proofErr w:type="gramEnd"/>
+      <w:r>
+        <w:t>Arb Win) (0.1–0.9). Lines: E[MOIC], E[IRR], P(Loss). Shows how sensitive fund returns are to arbitration win probability |</w:t>
       </w:r>
     </w:p>
     <w:p>
@@ -250,8 +330,13 @@
     <w:p/>
     <w:p>
       <w:r>
-        <w:t>### TAB 4 — INVESTMENT &amp; WATERFALL ANALYSIS *(replaces "Investment Analysis")*</w:t>
-      </w:r>
+        <w:t>### TAB 4 — INVESTMENT &amp; WATERFALL ANALYSIS *(replaces "Investment Analysis</w:t>
+      </w:r>
+      <w:proofErr w:type="gramStart"/>
+      <w:r>
+        <w:t>")*</w:t>
+      </w:r>
+      <w:proofErr w:type="gramEnd"/>
     </w:p>
     <w:p/>
     <w:p>
@@ -271,13 +356,29 @@
     </w:p>
     <w:p>
       <w:r>
-        <w:t>| 2 | **Funding Waterfall Flow** | Visual flow diagram | Legal Costs (investment) → Collected Award → min(CM × Legal, AR × Collected) → Fund Return → Net Profit. Horizontal stacked bar breakdown |</w:t>
+        <w:t xml:space="preserve">| 2 | **Funding Waterfall Flow** | Visual flow diagram | Legal Costs (investment) → Collected Award → </w:t>
+      </w:r>
+      <w:proofErr w:type="gramStart"/>
+      <w:r>
+        <w:t>min(</w:t>
+      </w:r>
+      <w:proofErr w:type="gramEnd"/>
+      <w:r>
+        <w:t>CM × Legal, AR × Collected) → Fund Return → Net Profit. Horizontal stacked bar breakdown |</w:t>
       </w:r>
     </w:p>
     <w:p>
       <w:r>
         <w:lastRenderedPageBreak/>
-        <w:t>| 3 | **Per-Claim Funding Analytics Table** | HTML table | Claim, Jurisdiction, E[Legal Cost], E[Collected], Fund Share @ selected CM/AR, E[Return], E[Net], Return/Legal-Cost ratio |</w:t>
+        <w:t xml:space="preserve">| 3 | **Per-Claim Funding Analytics Table** | HTML table | Claim, Jurisdiction, </w:t>
+      </w:r>
+      <w:proofErr w:type="gramStart"/>
+      <w:r>
+        <w:t>E[</w:t>
+      </w:r>
+      <w:proofErr w:type="gramEnd"/>
+      <w:r>
+        <w:t>Legal Cost], E[Collected], Fund Share @ selected CM/AR, E[Return], E[Net], Return/Legal-Cost ratio |</w:t>
       </w:r>
     </w:p>
     <w:p>
@@ -313,7 +414,15 @@
     </w:p>
     <w:p>
       <w:r>
-        <w:t>| 7 | **Cost Multiple Selector Buttons** | Button group | Selects a CM row — updates charts below |</w:t>
+        <w:t xml:space="preserve">| 7 | **Cost Multiple Selector Buttons** | Button group | Selects a CM row — updates </w:t>
+      </w:r>
+      <w:proofErr w:type="gramStart"/>
+      <w:r>
+        <w:t>charts</w:t>
+      </w:r>
+      <w:proofErr w:type="gramEnd"/>
+      <w:r>
+        <w:t xml:space="preserve"> below |</w:t>
       </w:r>
     </w:p>
     <w:p>
@@ -363,7 +472,15 @@
       </w:r>
       <w:proofErr w:type="spellEnd"/>
       <w:r>
-        <w:t xml:space="preserve"> Duration. Row 2: E[Legal Cost], E[Collected], Fund Share, E[Net] |</w:t>
+        <w:t xml:space="preserve"> Duration. Row 2: </w:t>
+      </w:r>
+      <w:proofErr w:type="gramStart"/>
+      <w:r>
+        <w:t>E[</w:t>
+      </w:r>
+      <w:proofErr w:type="gramEnd"/>
+      <w:r>
+        <w:t>Legal Cost], E[Collected], Fund Share, E[Net] |</w:t>
       </w:r>
     </w:p>
     <w:p>
@@ -385,8 +502,13 @@
     <w:p/>
     <w:p>
       <w:r>
-        <w:t>### TAB 6 — LEGAL COSTS *(Critical for Lit Funding — costs = investment)*</w:t>
-      </w:r>
+        <w:t xml:space="preserve">### TAB 6 — LEGAL COSTS *(Critical for Lit Funding — costs = </w:t>
+      </w:r>
+      <w:proofErr w:type="gramStart"/>
+      <w:r>
+        <w:t>investment)*</w:t>
+      </w:r>
+      <w:proofErr w:type="gramEnd"/>
     </w:p>
     <w:p/>
     <w:p>
@@ -458,7 +580,15 @@
     </w:p>
     <w:p>
       <w:r>
-        <w:t xml:space="preserve">| 1 | **Portfolio KPI Cards** | 6 KPIs | Total Legal Costs, E[Collected], E[Fund Return], E[Net Profit], </w:t>
+        <w:t xml:space="preserve">| 1 | **Portfolio KPI Cards** | 6 KPIs | Total Legal Costs, E[Collected], </w:t>
+      </w:r>
+      <w:proofErr w:type="gramStart"/>
+      <w:r>
+        <w:t>E[</w:t>
+      </w:r>
+      <w:proofErr w:type="gramEnd"/>
+      <w:r>
+        <w:t xml:space="preserve">Fund Return], E[Net Profit], </w:t>
       </w:r>
       <w:proofErr w:type="spellStart"/>
       <w:r>
@@ -479,13 +609,29 @@
     </w:p>
     <w:p>
       <w:r>
-        <w:t>| 2 | **J-Curve Fan Chart** | Multi-line fan + sliders | X: Months. Y: Cumulative cashflow. Bands P10–P90. Sliders: Cost Multiple + Award Ratio |</w:t>
+        <w:t xml:space="preserve">| 2 | **J-Curve Fan Chart** | </w:t>
+      </w:r>
+      <w:proofErr w:type="gramStart"/>
+      <w:r>
+        <w:t>Multi-line</w:t>
+      </w:r>
+      <w:proofErr w:type="gramEnd"/>
+      <w:r>
+        <w:t xml:space="preserve"> fan + sliders | X: Months. Y: Cumulative cashflow. Bands P10–P90. Sliders: Cost Multiple + Award Ratio |</w:t>
       </w:r>
     </w:p>
     <w:p>
       <w:r>
         <w:lastRenderedPageBreak/>
-        <w:t>| 3 | **Annual Resolution &amp; Recovery Timeline** | Two side-by-side charts | Chart A: % claims resolving each year + cumulative. Chart B: E[Fund Return] per year + cumulative |</w:t>
+        <w:t xml:space="preserve">| 3 | **Annual Resolution &amp; Recovery Timeline** | Two side-by-side charts | Chart A: % claims resolving each year + cumulative. Chart B: </w:t>
+      </w:r>
+      <w:proofErr w:type="gramStart"/>
+      <w:r>
+        <w:t>E[</w:t>
+      </w:r>
+      <w:proofErr w:type="gramEnd"/>
+      <w:r>
+        <w:t>Fund Return] per year + cumulative |</w:t>
       </w:r>
     </w:p>
     <w:p>
@@ -495,7 +641,15 @@
     </w:p>
     <w:p>
       <w:r>
-        <w:t>| 5 | **Per-Claim Expected Cashflow Table** | HTML table | Claim, E[Legal Cost], E[Collected], E[Fund Return], P5/P50/P95, E[Duration]. Portfolio total |</w:t>
+        <w:t xml:space="preserve">| 5 | **Per-Claim Expected Cashflow Table** | HTML table | Claim, </w:t>
+      </w:r>
+      <w:proofErr w:type="gramStart"/>
+      <w:r>
+        <w:t>E[</w:t>
+      </w:r>
+      <w:proofErr w:type="gramEnd"/>
+      <w:r>
+        <w:t>Legal Cost], E[Collected], E[Fund Return], P5/P50/P95, E[Duration]. Portfolio total |</w:t>
       </w:r>
     </w:p>
     <w:p>
@@ -505,14 +659,27 @@
     </w:p>
     <w:p>
       <w:r>
-        <w:t>| 7 | **Funding Scenario Cashflows** | HTML table | Key CM/AR combos: Investment, E[Fund Return], E[Net], E[MOIC], P(Loss) |</w:t>
-      </w:r>
-    </w:p>
-    <w:p/>
-    <w:p>
-      <w:r>
-        <w:t>### TAB 8 — ARB-WIN SENSITIVITY *(replaces Stochastic Pricing — not available for Lit Funding)*</w:t>
-      </w:r>
+        <w:t xml:space="preserve">| 7 | **Funding Scenario Cashflows** | HTML table | Key CM/AR combos: Investment, </w:t>
+      </w:r>
+      <w:proofErr w:type="gramStart"/>
+      <w:r>
+        <w:t>E[</w:t>
+      </w:r>
+      <w:proofErr w:type="gramEnd"/>
+      <w:r>
+        <w:t>Fund Return], E[Net], E[MOIC], P(Loss) |</w:t>
+      </w:r>
+    </w:p>
+    <w:p/>
+    <w:p>
+      <w:r>
+        <w:t xml:space="preserve">### TAB 8 — ARB-WIN SENSITIVITY *(replaces Stochastic Pricing — not available for Lit </w:t>
+      </w:r>
+      <w:proofErr w:type="gramStart"/>
+      <w:r>
+        <w:t>Funding)*</w:t>
+      </w:r>
+      <w:proofErr w:type="gramEnd"/>
     </w:p>
     <w:p/>
     <w:p>
@@ -527,27 +694,67 @@
     </w:p>
     <w:p>
       <w:r>
-        <w:t>| 1 | **Sensitivity KPIs** | 4 KPIs | Base P(Arb Win), Sensitivity Range, # Grid Points, Selected CM/AR |</w:t>
-      </w:r>
-    </w:p>
-    <w:p>
-      <w:r>
-        <w:t>| 2 | **E[MOIC] vs P(Arb Win)** | Line chart with confidence band | X: P(Arb Win). Y: E[MOIC]. Band: P25–P75. Multiple lines for different CM/AR combos |</w:t>
-      </w:r>
-    </w:p>
-    <w:p>
-      <w:r>
-        <w:t>| 3 | **P(Loss) vs P(Arb Win)** | Line chart | Same X-axis, Y: P(Loss). Shows how portfolio loss probability varies |</w:t>
-      </w:r>
-    </w:p>
-    <w:p>
-      <w:r>
-        <w:t>| 4 | **E[IRR] vs P(Arb Win)** | Line chart | |</w:t>
-      </w:r>
-    </w:p>
-    <w:p>
-      <w:r>
-        <w:t>| 5 | **Breakeven P(Arb Win)** | **NEW: Highlighted metric** | The minimum P(Arb Win) needed for E[MOIC] ≥ 1.0 at each CM/AR combo. Critical decision metric |</w:t>
+        <w:t xml:space="preserve">| 1 | **Sensitivity KPIs** | 4 KPIs | Base </w:t>
+      </w:r>
+      <w:proofErr w:type="gramStart"/>
+      <w:r>
+        <w:t>P(</w:t>
+      </w:r>
+      <w:proofErr w:type="gramEnd"/>
+      <w:r>
+        <w:t>Arb Win), Sensitivity Range, # Grid Points, Selected CM/AR |</w:t>
+      </w:r>
+    </w:p>
+    <w:p>
+      <w:r>
+        <w:t xml:space="preserve">| 2 | **E[MOIC] vs </w:t>
+      </w:r>
+      <w:proofErr w:type="gramStart"/>
+      <w:r>
+        <w:t>P(</w:t>
+      </w:r>
+      <w:proofErr w:type="gramEnd"/>
+      <w:r>
+        <w:t>Arb Win)** | Line chart with confidence band | X: P(Arb Win). Y: E[MOIC]. Band: P25–P75. Multiple lines for different CM/AR combos |</w:t>
+      </w:r>
+    </w:p>
+    <w:p>
+      <w:r>
+        <w:t xml:space="preserve">| 3 | **P(Loss) vs </w:t>
+      </w:r>
+      <w:proofErr w:type="gramStart"/>
+      <w:r>
+        <w:t>P(</w:t>
+      </w:r>
+      <w:proofErr w:type="gramEnd"/>
+      <w:r>
+        <w:t>Arb Win)** | Line chart | Same X-axis, Y: P(Loss). Shows how portfolio loss probability varies |</w:t>
+      </w:r>
+    </w:p>
+    <w:p>
+      <w:r>
+        <w:t xml:space="preserve">| 4 | **E[IRR] vs </w:t>
+      </w:r>
+      <w:proofErr w:type="gramStart"/>
+      <w:r>
+        <w:t>P(</w:t>
+      </w:r>
+      <w:proofErr w:type="gramEnd"/>
+      <w:r>
+        <w:t>Arb Win)** | Line chart | |</w:t>
+      </w:r>
+    </w:p>
+    <w:p>
+      <w:r>
+        <w:t xml:space="preserve">| 5 | **Breakeven </w:t>
+      </w:r>
+      <w:proofErr w:type="gramStart"/>
+      <w:r>
+        <w:t>P(</w:t>
+      </w:r>
+      <w:proofErr w:type="gramEnd"/>
+      <w:r>
+        <w:t>Arb Win)** | **NEW: Highlighted metric** | The minimum P(Arb Win) needed for E[MOIC] ≥ 1.0 at each CM/AR combo. Critical decision metric |</w:t>
       </w:r>
     </w:p>
     <w:p>
@@ -566,8 +773,13 @@
     <w:p/>
     <w:p>
       <w:r>
-        <w:t>### TAB 9 — PRICING SURFACE *(adapted: CM × AR instead of Upfront × Tail)*</w:t>
-      </w:r>
+        <w:t xml:space="preserve">### TAB 9 — PRICING SURFACE *(adapted: CM × AR instead of Upfront × </w:t>
+      </w:r>
+      <w:proofErr w:type="gramStart"/>
+      <w:r>
+        <w:t>Tail)*</w:t>
+      </w:r>
+      <w:proofErr w:type="gramEnd"/>
     </w:p>
     <w:p/>
     <w:p>
@@ -588,7 +800,15 @@
     </w:p>
     <w:p>
       <w:r>
-        <w:t>| 2 | **Controls** | Sliders + mode buttons + dropdown | Cost Multiple slider, Award Ratio slider, View Mode (Heatmap/Contour/3D Surface), Metric dropdown (E[IRR], E[MOIC], Median, P5, CVaR, P(Loss), P(Hurdle), etc.) |</w:t>
+        <w:t xml:space="preserve">| 2 | **Controls** | Sliders + mode buttons + dropdown | Cost Multiple </w:t>
+      </w:r>
+      <w:proofErr w:type="gramStart"/>
+      <w:r>
+        <w:t>slider</w:t>
+      </w:r>
+      <w:proofErr w:type="gramEnd"/>
+      <w:r>
+        <w:t>, Award Ratio slider, View Mode (Heatmap/Contour/3D Surface), Metric dropdown (E[IRR], E[MOIC], Median, P5, CVaR, P(Loss), P(Hurdle), etc.) |</w:t>
       </w:r>
     </w:p>
     <w:p>
@@ -672,7 +892,15 @@
     </w:p>
     <w:p>
       <w:r>
-        <w:t xml:space="preserve">| 2 | **E[MOIC] vs Cost Multiple** | Multi-line chart (white </w:t>
+        <w:t xml:space="preserve">| 2 | **E[MOIC] vs Cost Multiple** | </w:t>
+      </w:r>
+      <w:proofErr w:type="gramStart"/>
+      <w:r>
+        <w:t>Multi-line</w:t>
+      </w:r>
+      <w:proofErr w:type="gramEnd"/>
+      <w:r>
+        <w:t xml:space="preserve"> chart (white </w:t>
       </w:r>
       <w:proofErr w:type="spellStart"/>
       <w:r>
@@ -685,12 +913,28 @@
     </w:p>
     <w:p>
       <w:r>
-        <w:t>| 3 | **E[IRR] vs Cost Multiple** | Multi-line chart | Reference: 30% hurdle |</w:t>
-      </w:r>
-    </w:p>
-    <w:p>
-      <w:r>
-        <w:t>| 4 | **P(Loss) vs Cost Multiple** | Multi-line chart | Reference: 20% threshold |</w:t>
+        <w:t xml:space="preserve">| 3 | **E[IRR] vs Cost Multiple** | </w:t>
+      </w:r>
+      <w:proofErr w:type="gramStart"/>
+      <w:r>
+        <w:t>Multi-line</w:t>
+      </w:r>
+      <w:proofErr w:type="gramEnd"/>
+      <w:r>
+        <w:t xml:space="preserve"> chart | Reference: 30% hurdle |</w:t>
+      </w:r>
+    </w:p>
+    <w:p>
+      <w:r>
+        <w:t xml:space="preserve">| 4 | **P(Loss) vs Cost Multiple** | </w:t>
+      </w:r>
+      <w:proofErr w:type="gramStart"/>
+      <w:r>
+        <w:t>Multi-line</w:t>
+      </w:r>
+      <w:proofErr w:type="gramEnd"/>
+      <w:r>
+        <w:t xml:space="preserve"> chart | Reference: 20% threshold |</w:t>
       </w:r>
     </w:p>
     <w:p/>
@@ -708,7 +952,15 @@
     <w:p/>
     <w:p>
       <w:r>
-        <w:t>&gt; **Core investor question:** "I'm buying claims outright at X% of SOC and sharing Y% of the award with the seller. What purchase price and award share maximise my return?"</w:t>
+        <w:t xml:space="preserve">&gt; **Core investor </w:t>
+      </w:r>
+      <w:proofErr w:type="gramStart"/>
+      <w:r>
+        <w:t>question:*</w:t>
+      </w:r>
+      <w:proofErr w:type="gramEnd"/>
+      <w:r>
+        <w:t>* "I'm buying claims outright at X% of SOC and sharing Y% of the award with the seller. What purchase price and award share maximise my return?"</w:t>
       </w:r>
     </w:p>
     <w:p/>
@@ -743,7 +995,15 @@
       </w:r>
       <w:proofErr w:type="spellEnd"/>
       <w:r>
-        <w:t xml:space="preserve"> Win Rate, Total Investment (= Upfront), E[Collected], E[Net to Fund], E[Net Profit] |</w:t>
+        <w:t xml:space="preserve"> Win Rate, Total Investment (= Upfront), E[Collected], </w:t>
+      </w:r>
+      <w:proofErr w:type="gramStart"/>
+      <w:r>
+        <w:t>E[</w:t>
+      </w:r>
+      <w:proofErr w:type="gramEnd"/>
+      <w:r>
+        <w:t>Net to Fund], E[Net Profit] |</w:t>
       </w:r>
     </w:p>
     <w:p>
@@ -756,7 +1016,15 @@
       </w:r>
       <w:proofErr w:type="spellEnd"/>
       <w:r>
-        <w:t xml:space="preserve"> Duration, E[Legal Costs], Best MOIC, Purchase Price (₹ Cr) |</w:t>
+        <w:t xml:space="preserve"> Duration, </w:t>
+      </w:r>
+      <w:proofErr w:type="gramStart"/>
+      <w:r>
+        <w:t>E[</w:t>
+      </w:r>
+      <w:proofErr w:type="gramEnd"/>
+      <w:r>
+        <w:t>Legal Costs], Best MOIC, Purchase Price (₹ Cr) |</w:t>
       </w:r>
     </w:p>
     <w:p>
@@ -766,7 +1034,15 @@
     </w:p>
     <w:p>
       <w:r>
-        <w:t>| 5 | **J-Curve Fan Chart** | Multi-line fan | Cumulative cashflow P10–P90 |</w:t>
+        <w:t xml:space="preserve">| 5 | **J-Curve Fan Chart** | </w:t>
+      </w:r>
+      <w:proofErr w:type="gramStart"/>
+      <w:r>
+        <w:t>Multi-line</w:t>
+      </w:r>
+      <w:proofErr w:type="gramEnd"/>
+      <w:r>
+        <w:t xml:space="preserve"> fan | Cumulative cashflow P10–P90 |</w:t>
       </w:r>
     </w:p>
     <w:p>
@@ -781,12 +1057,28 @@
     </w:p>
     <w:p>
       <w:r>
-        <w:t>| 8 | **Purchase Scenario Summary** | HTML table + dropdown | Rows: Upfront %. Cols: Investment, E[MOIC], E[IRR], P(Loss), E[Net Return], P(Hurdle). Dropdown for Award Share % |</w:t>
-      </w:r>
-    </w:p>
-    <w:p>
-      <w:r>
-        <w:t>| 9 | **Cross-Claim Comparison: IRR &amp; MOIC** | Dual-axis bar | Per claim. Dropdowns for Upfront + Award Share |</w:t>
+        <w:t xml:space="preserve">| 8 | **Purchase Scenario Summary** | HTML table + dropdown | Rows: Upfront %. Cols: Investment, E[MOIC], E[IRR], P(Loss), </w:t>
+      </w:r>
+      <w:proofErr w:type="gramStart"/>
+      <w:r>
+        <w:t>E[</w:t>
+      </w:r>
+      <w:proofErr w:type="gramEnd"/>
+      <w:r>
+        <w:t>Net Return], P(Hurdle). Dropdown for Award Share % |</w:t>
+      </w:r>
+    </w:p>
+    <w:p>
+      <w:r>
+        <w:t>| 9 | **</w:t>
+      </w:r>
+      <w:proofErr w:type="gramStart"/>
+      <w:r>
+        <w:t>Cross-Claim</w:t>
+      </w:r>
+      <w:proofErr w:type="gramEnd"/>
+      <w:r>
+        <w:t xml:space="preserve"> Comparison: IRR &amp; MOIC** | Dual-axis bar | Per claim. Dropdowns for Upfront + Award Share |</w:t>
       </w:r>
     </w:p>
     <w:p/>
@@ -798,8 +1090,13 @@
     <w:p/>
     <w:p>
       <w:r>
-        <w:t>*(Same as Upfront-Tail Tab 2 — identical probability engine)*</w:t>
-      </w:r>
+        <w:t xml:space="preserve">*(Same as Upfront-Tail Tab 2 — identical probability </w:t>
+      </w:r>
+      <w:proofErr w:type="gramStart"/>
+      <w:r>
+        <w:t>engine)*</w:t>
+      </w:r>
+      <w:proofErr w:type="gramEnd"/>
     </w:p>
     <w:p/>
     <w:p>
@@ -826,8 +1123,13 @@
     <w:p/>
     <w:p>
       <w:r>
-        <w:t>*(Same structure as Upfront-Tail Tab 3)*</w:t>
-      </w:r>
+        <w:t xml:space="preserve">*(Same structure as Upfront-Tail Tab </w:t>
+      </w:r>
+      <w:proofErr w:type="gramStart"/>
+      <w:r>
+        <w:t>3)*</w:t>
+      </w:r>
+      <w:proofErr w:type="gramEnd"/>
     </w:p>
     <w:p/>
     <w:p>
@@ -909,7 +1211,23 @@
     </w:p>
     <w:p>
       <w:r>
-        <w:t>| 10 | **Ownership Economics Table** | **NEW: HTML table** | Award Share % → Fund's effective ownership → E[Return per ₹ invested] → Implied portfolio value multiple. Transparent look at what you're actually buying |</w:t>
+        <w:t xml:space="preserve">| 10 | **Ownership Economics Table** | **NEW: HTML table** | Award Share % → Fund's effective ownership → </w:t>
+      </w:r>
+      <w:proofErr w:type="gramStart"/>
+      <w:r>
+        <w:t>E[</w:t>
+      </w:r>
+      <w:proofErr w:type="gramEnd"/>
+      <w:r>
+        <w:t xml:space="preserve">Return per ₹ invested] → Implied portfolio value multiple. Transparent look at what you're </w:t>
+      </w:r>
+      <w:proofErr w:type="gramStart"/>
+      <w:r>
+        <w:t>actually buying</w:t>
+      </w:r>
+      <w:proofErr w:type="gramEnd"/>
+      <w:r>
+        <w:t xml:space="preserve"> |</w:t>
       </w:r>
     </w:p>
     <w:p/>
@@ -968,8 +1286,13 @@
     <w:p/>
     <w:p>
       <w:r>
-        <w:t>*(Same as Upfront-Tail Tab 6)*</w:t>
-      </w:r>
+        <w:t xml:space="preserve">*(Same as Upfront-Tail Tab </w:t>
+      </w:r>
+      <w:proofErr w:type="gramStart"/>
+      <w:r>
+        <w:t>6)*</w:t>
+      </w:r>
+      <w:proofErr w:type="gramEnd"/>
     </w:p>
     <w:p/>
     <w:p>
@@ -990,7 +1313,15 @@
     </w:p>
     <w:p>
       <w:r>
-        <w:t xml:space="preserve">| 1 | **Portfolio KPI Cards** | 6 KPIs | Total SOC, Purchase Price, E[Collected], E[Legal Costs], E[Net Cashflow], P(Win) </w:t>
+        <w:t xml:space="preserve">| 1 | **Portfolio KPI Cards** | 6 KPIs | Total SOC, Purchase Price, E[Collected], </w:t>
+      </w:r>
+      <w:proofErr w:type="gramStart"/>
+      <w:r>
+        <w:t>E[</w:t>
+      </w:r>
+      <w:proofErr w:type="gramEnd"/>
+      <w:r>
+        <w:t xml:space="preserve">Legal Costs], E[Net Cashflow], P(Win) </w:t>
       </w:r>
       <w:proofErr w:type="spellStart"/>
       <w:r>
@@ -1185,17 +1516,41 @@
     </w:p>
     <w:p>
       <w:r>
-        <w:t>| 2 | **E[MOIC] vs Upfront %** | Multi-line (one per award share) |</w:t>
-      </w:r>
-    </w:p>
-    <w:p>
-      <w:r>
-        <w:t>| 3 | **E[IRR] vs Upfront %** | Multi-line, 30% hurdle |</w:t>
-      </w:r>
-    </w:p>
-    <w:p>
-      <w:r>
-        <w:t>| 4 | **P(Loss) vs Upfront %** | Multi-line, 20% threshold |</w:t>
+        <w:t xml:space="preserve">| 2 | **E[MOIC] vs Upfront %** | </w:t>
+      </w:r>
+      <w:proofErr w:type="gramStart"/>
+      <w:r>
+        <w:t>Multi-line</w:t>
+      </w:r>
+      <w:proofErr w:type="gramEnd"/>
+      <w:r>
+        <w:t xml:space="preserve"> (one per award share) |</w:t>
+      </w:r>
+    </w:p>
+    <w:p>
+      <w:r>
+        <w:t xml:space="preserve">| 3 | **E[IRR] vs Upfront %** | </w:t>
+      </w:r>
+      <w:proofErr w:type="gramStart"/>
+      <w:r>
+        <w:t>Multi-line</w:t>
+      </w:r>
+      <w:proofErr w:type="gramEnd"/>
+      <w:r>
+        <w:t>, 30% hurdle |</w:t>
+      </w:r>
+    </w:p>
+    <w:p>
+      <w:r>
+        <w:t xml:space="preserve">| 4 | **P(Loss) vs Upfront %** | </w:t>
+      </w:r>
+      <w:proofErr w:type="gramStart"/>
+      <w:r>
+        <w:t>Multi-line</w:t>
+      </w:r>
+      <w:proofErr w:type="gramEnd"/>
+      <w:r>
+        <w:t>, 20% threshold |</w:t>
       </w:r>
     </w:p>
     <w:p/>
@@ -1213,7 +1568,15 @@
     <w:p/>
     <w:p>
       <w:r>
-        <w:t>&gt; **Core investor question:** "I'm structuring my investment as staged milestone payments triggered by case progress events. How does staging reduce my downside vs a lump-sum purchase, and what returns can I expect?"</w:t>
+        <w:t xml:space="preserve">&gt; **Core investor </w:t>
+      </w:r>
+      <w:proofErr w:type="gramStart"/>
+      <w:r>
+        <w:t>question:*</w:t>
+      </w:r>
+      <w:proofErr w:type="gramEnd"/>
+      <w:r>
+        <w:t>* "I'm structuring my investment as staged milestone payments triggered by case progress events. How does staging reduce my downside vs a lump-sum purchase, and what returns can I expect?"</w:t>
       </w:r>
     </w:p>
     <w:p/>
@@ -1236,9 +1599,14 @@
     </w:p>
     <w:p>
       <w:r>
-        <w:t>| 1 | **Staged Payment Economics** | Expandable formula card | Total Investment = Σ(</w:t>
-      </w:r>
-      <w:proofErr w:type="spellStart"/>
+        <w:t xml:space="preserve">| 1 | **Staged Payment Economics** | Expandable formula card | Total Investment = </w:t>
+      </w:r>
+      <w:proofErr w:type="gramStart"/>
+      <w:r>
+        <w:t>Σ(</w:t>
+      </w:r>
+      <w:proofErr w:type="spellStart"/>
+      <w:proofErr w:type="gramEnd"/>
       <w:r>
         <w:t>Milestone_i</w:t>
       </w:r>
@@ -1265,12 +1633,28 @@
       </w:r>
       <w:proofErr w:type="spellEnd"/>
       <w:r>
-        <w:t xml:space="preserve"> Win Rate, Total E[Investment] (staged sum), E[Collected], E[Net to Fund], E[Net Profit] |</w:t>
-      </w:r>
-    </w:p>
-    <w:p>
-      <w:r>
-        <w:t xml:space="preserve">| 3 | **Supporting Metrics KPIs** | 4-column row | # Milestones, E[Milestones Triggered], </w:t>
+        <w:t xml:space="preserve"> Win Rate, Total E[Investment] (staged sum), E[Collected], </w:t>
+      </w:r>
+      <w:proofErr w:type="gramStart"/>
+      <w:r>
+        <w:t>E[</w:t>
+      </w:r>
+      <w:proofErr w:type="gramEnd"/>
+      <w:r>
+        <w:t>Net to Fund], E[Net Profit] |</w:t>
+      </w:r>
+    </w:p>
+    <w:p>
+      <w:r>
+        <w:t xml:space="preserve">| 3 | **Supporting Metrics KPIs** | 4-column row | # Milestones, </w:t>
+      </w:r>
+      <w:proofErr w:type="gramStart"/>
+      <w:r>
+        <w:t>E[</w:t>
+      </w:r>
+      <w:proofErr w:type="gramEnd"/>
+      <w:r>
+        <w:t xml:space="preserve">Milestones Triggered], </w:t>
       </w:r>
       <w:proofErr w:type="spellStart"/>
       <w:r>
@@ -1288,7 +1672,15 @@
     </w:p>
     <w:p>
       <w:r>
-        <w:t>| 5 | **J-Curve Fan Chart** | Multi-line fan | Cumulative cashflow — step-function outflows at milestone dates overlaid with recovery inflows |</w:t>
+        <w:t xml:space="preserve">| 5 | **J-Curve Fan Chart** | </w:t>
+      </w:r>
+      <w:proofErr w:type="gramStart"/>
+      <w:r>
+        <w:t>Multi-line</w:t>
+      </w:r>
+      <w:proofErr w:type="gramEnd"/>
+      <w:r>
+        <w:t xml:space="preserve"> fan | Cumulative cashflow — step-function outflows at milestone dates overlaid with recovery inflows |</w:t>
       </w:r>
     </w:p>
     <w:p>
@@ -1308,14 +1700,27 @@
     </w:p>
     <w:p>
       <w:r>
-        <w:t>| 9 | **Cross-Claim Comparison** | Dual-axis bar | Per claim MOIC/IRR with dropdown |</w:t>
-      </w:r>
-    </w:p>
-    <w:p/>
-    <w:p>
-      <w:r>
-        <w:t>### TAB 2 — MILESTONE ANALYSIS *(NEW — Unique to Staged)*</w:t>
-      </w:r>
+        <w:t>| 9 | **</w:t>
+      </w:r>
+      <w:proofErr w:type="gramStart"/>
+      <w:r>
+        <w:t>Cross-Claim</w:t>
+      </w:r>
+      <w:proofErr w:type="gramEnd"/>
+      <w:r>
+        <w:t xml:space="preserve"> Comparison** | Dual-axis bar | Per claim MOIC/IRR with dropdown |</w:t>
+      </w:r>
+    </w:p>
+    <w:p/>
+    <w:p>
+      <w:r>
+        <w:t xml:space="preserve">### TAB 2 — MILESTONE ANALYSIS *(NEW — Unique to </w:t>
+      </w:r>
+      <w:proofErr w:type="gramStart"/>
+      <w:r>
+        <w:t>Staged)*</w:t>
+      </w:r>
+      <w:proofErr w:type="gramEnd"/>
     </w:p>
     <w:p/>
     <w:p>
@@ -1330,7 +1735,15 @@
     </w:p>
     <w:p>
       <w:r>
-        <w:t>| 1 | **Milestone Summary KPIs** | 5-column row | # Milestones, Total Committed, E[Deployed], Deployment Ratio, E[Cost Savings vs Lump Sum] |</w:t>
+        <w:t xml:space="preserve">| 1 | **Milestone Summary KPIs** | 5-column row | # Milestones, Total Committed, E[Deployed], Deployment Ratio, </w:t>
+      </w:r>
+      <w:proofErr w:type="gramStart"/>
+      <w:r>
+        <w:t>E[</w:t>
+      </w:r>
+      <w:proofErr w:type="gramEnd"/>
+      <w:r>
+        <w:t>Cost Savings vs Lump Sum] |</w:t>
       </w:r>
     </w:p>
     <w:p>
@@ -1343,7 +1756,15 @@
       </w:r>
       <w:proofErr w:type="spellEnd"/>
       <w:r>
-        <w:t>: payment size. Shows when capital actually gets deployed |</w:t>
+        <w:t xml:space="preserve">: payment size. Shows when capital </w:t>
+      </w:r>
+      <w:proofErr w:type="gramStart"/>
+      <w:r>
+        <w:t>actually gets</w:t>
+      </w:r>
+      <w:proofErr w:type="gramEnd"/>
+      <w:r>
+        <w:t xml:space="preserve"> deployed |</w:t>
       </w:r>
     </w:p>
     <w:p>
@@ -1354,7 +1775,15 @@
     <w:p>
       <w:r>
         <w:lastRenderedPageBreak/>
-        <w:t>| 4 | **Capital Deployment Probability** | Stacked bar chart | X: Total capital deployed (bands). Y: Probability. Shows distribution of how much capital actually goes out the door. Key insight: staged means you might pay less than committed |</w:t>
+        <w:t xml:space="preserve">| 4 | **Capital Deployment Probability** | Stacked bar chart | X: Total capital deployed (bands). Y: Probability. Shows distribution of how much capital </w:t>
+      </w:r>
+      <w:proofErr w:type="gramStart"/>
+      <w:r>
+        <w:t>actually goes</w:t>
+      </w:r>
+      <w:proofErr w:type="gramEnd"/>
+      <w:r>
+        <w:t xml:space="preserve"> out the door. Key insight: staged means you might pay less than committed |</w:t>
       </w:r>
     </w:p>
     <w:p>
@@ -1364,7 +1793,15 @@
     </w:p>
     <w:p>
       <w:r>
-        <w:t>| 6 | **Staged vs Lump-Sum Comparison** | **NEW: Side-by-side KPI cards** | E[MOIC] Staged vs Lump Sum, E[IRR] Staged vs Lump Sum, P(Loss) Staged vs Lump Sum, E[Capital Deployed] Staged vs Committed. Shows the staging advantage quantified |</w:t>
+        <w:t xml:space="preserve">| 6 | **Staged vs Lump-Sum Comparison** | **NEW: Side-by-side KPI cards** | E[MOIC] Staged vs Lump Sum, E[IRR] Staged vs Lump Sum, P(Loss) Staged vs Lump Sum, </w:t>
+      </w:r>
+      <w:proofErr w:type="gramStart"/>
+      <w:r>
+        <w:t>E[</w:t>
+      </w:r>
+      <w:proofErr w:type="gramEnd"/>
+      <w:r>
+        <w:t>Capital Deployed] Staged vs Committed. Shows the staging advantage quantified |</w:t>
       </w:r>
     </w:p>
     <w:p>
@@ -1381,8 +1818,13 @@
     <w:p/>
     <w:p>
       <w:r>
-        <w:t>*(Same as Upfront-Tail Tab 2)*</w:t>
-      </w:r>
+        <w:t xml:space="preserve">*(Same as Upfront-Tail Tab </w:t>
+      </w:r>
+      <w:proofErr w:type="gramStart"/>
+      <w:r>
+        <w:t>2)*</w:t>
+      </w:r>
+      <w:proofErr w:type="gramEnd"/>
     </w:p>
     <w:p/>
     <w:p>
@@ -1393,8 +1835,13 @@
     <w:p/>
     <w:p>
       <w:r>
-        <w:t>*(Same as Upfront-Tail Tab 3)*</w:t>
-      </w:r>
+        <w:t xml:space="preserve">*(Same as Upfront-Tail Tab </w:t>
+      </w:r>
+      <w:proofErr w:type="gramStart"/>
+      <w:r>
+        <w:t>3)*</w:t>
+      </w:r>
+      <w:proofErr w:type="gramEnd"/>
     </w:p>
     <w:p/>
     <w:p>
@@ -1415,7 +1862,15 @@
     </w:p>
     <w:p>
       <w:r>
-        <w:t>| 1 | **Investment Statistics KPI Grid** | 8 KPIs | Total Committed, E[Deployed], Best E[MOIC], Best E[IRR], Best P(Loss), E[Capital Efficiency] (MOIC per ₹ deployed), Sweet Spot, Max Breakeven |</w:t>
+        <w:t xml:space="preserve">| 1 | **Investment Statistics KPI Grid** | 8 KPIs | Total Committed, E[Deployed], Best E[MOIC], Best E[IRR], Best P(Loss), </w:t>
+      </w:r>
+      <w:proofErr w:type="gramStart"/>
+      <w:r>
+        <w:t>E[</w:t>
+      </w:r>
+      <w:proofErr w:type="gramEnd"/>
+      <w:r>
+        <w:t>Capital Efficiency] (MOIC per ₹ deployed), Sweet Spot, Max Breakeven |</w:t>
       </w:r>
     </w:p>
     <w:p>
@@ -1464,7 +1919,15 @@
     </w:p>
     <w:p>
       <w:r>
-        <w:t>| 9 | **Capital Efficiency Frontier** | **NEW: Scatter + Pareto front** | X: E[Capital Deployed]. Y: E[MOIC]. Each dot = one grid combo. Pareto frontier highlighted: maximum MOIC for each deployment level. Helps investor find most capital-efficient structure |</w:t>
+        <w:t xml:space="preserve">| 9 | **Capital Efficiency Frontier** | **NEW: Scatter + Pareto front** | X: </w:t>
+      </w:r>
+      <w:proofErr w:type="gramStart"/>
+      <w:r>
+        <w:t>E[</w:t>
+      </w:r>
+      <w:proofErr w:type="gramEnd"/>
+      <w:r>
+        <w:t>Capital Deployed]. Y: E[MOIC]. Each dot = one grid combo. Pareto frontier highlighted: maximum MOIC for each deployment level. Helps investor find most capital-efficient structure |</w:t>
       </w:r>
     </w:p>
     <w:p/>
@@ -1523,8 +1986,13 @@
     <w:p/>
     <w:p>
       <w:r>
-        <w:t>*(Same as Upfront-Tail Tab 6)*</w:t>
-      </w:r>
+        <w:t xml:space="preserve">*(Same as Upfront-Tail Tab </w:t>
+      </w:r>
+      <w:proofErr w:type="gramStart"/>
+      <w:r>
+        <w:t>6)*</w:t>
+      </w:r>
+      <w:proofErr w:type="gramEnd"/>
     </w:p>
     <w:p/>
     <w:p>
@@ -1593,8 +2061,13 @@
     <w:p/>
     <w:p>
       <w:r>
-        <w:t>*(Same as Full Purchase Tab 8 — uses same grid engine)*</w:t>
-      </w:r>
+        <w:t xml:space="preserve">*(Same as Full Purchase Tab 8 — uses same grid </w:t>
+      </w:r>
+      <w:proofErr w:type="gramStart"/>
+      <w:r>
+        <w:t>engine)*</w:t>
+      </w:r>
+      <w:proofErr w:type="gramEnd"/>
     </w:p>
     <w:p/>
     <w:p>
@@ -1605,8 +2078,13 @@
     <w:p/>
     <w:p>
       <w:r>
-        <w:t>*(Same as Full Purchase Tab 9)*</w:t>
-      </w:r>
+        <w:t xml:space="preserve">*(Same as Full Purchase Tab </w:t>
+      </w:r>
+      <w:proofErr w:type="gramStart"/>
+      <w:r>
+        <w:t>9)*</w:t>
+      </w:r>
+      <w:proofErr w:type="gramEnd"/>
     </w:p>
     <w:p/>
     <w:p>
@@ -1617,8 +2095,13 @@
     <w:p/>
     <w:p>
       <w:r>
-        <w:t>*(Same as baseline Tab 10)*</w:t>
-      </w:r>
+        <w:t xml:space="preserve">*(Same as baseline Tab </w:t>
+      </w:r>
+      <w:proofErr w:type="gramStart"/>
+      <w:r>
+        <w:t>10)*</w:t>
+      </w:r>
+      <w:proofErr w:type="gramEnd"/>
     </w:p>
     <w:p/>
     <w:p>
@@ -1750,13 +2233,29 @@
     <w:p/>
     <w:p>
       <w:r>
-        <w:t>**Objective:** Ensure the results dashboard for the staged milestone payments structure correctly renders all tabs, charts, KPIs, and data with no hardcoded values, no broken components, and accurate simulation outputs.</w:t>
-      </w:r>
-    </w:p>
-    <w:p/>
-    <w:p>
-      <w:r>
-        <w:t>**Current State:**</w:t>
+        <w:t>**</w:t>
+      </w:r>
+      <w:proofErr w:type="gramStart"/>
+      <w:r>
+        <w:t>Objective:*</w:t>
+      </w:r>
+      <w:proofErr w:type="gramEnd"/>
+      <w:r>
+        <w:t>* Ensure the results dashboard for the staged milestone payments structure correctly renders all tabs, charts, KPIs, and data with no hardcoded values, no broken components, and accurate simulation outputs.</w:t>
+      </w:r>
+    </w:p>
+    <w:p/>
+    <w:p>
+      <w:r>
+        <w:t xml:space="preserve">**Current </w:t>
+      </w:r>
+      <w:proofErr w:type="gramStart"/>
+      <w:r>
+        <w:t>State:*</w:t>
+      </w:r>
+      <w:proofErr w:type="gramEnd"/>
+      <w:r>
+        <w:t>*</w:t>
       </w:r>
     </w:p>
     <w:p>
@@ -1822,7 +2321,15 @@
     <w:p/>
     <w:p>
       <w:r>
-        <w:t>**Validation Checklist:**</w:t>
+        <w:t xml:space="preserve">**Validation </w:t>
+      </w:r>
+      <w:proofErr w:type="gramStart"/>
+      <w:r>
+        <w:t>Checklist:*</w:t>
+      </w:r>
+      <w:proofErr w:type="gramEnd"/>
+      <w:r>
+        <w:t>*</w:t>
       </w:r>
     </w:p>
     <w:p/>
@@ -1874,9 +2381,14 @@
       </w:r>
       <w:proofErr w:type="spellStart"/>
       <w:r>
-        <w:t>dashboard_data.json</w:t>
-      </w:r>
-      <w:proofErr w:type="spellEnd"/>
+        <w:t>dashboard_</w:t>
+      </w:r>
+      <w:proofErr w:type="gramStart"/>
+      <w:r>
+        <w:t>data.json</w:t>
+      </w:r>
+      <w:proofErr w:type="spellEnd"/>
+      <w:proofErr w:type="gramEnd"/>
       <w:r>
         <w:t>` contains all required keys for staged structure</w:t>
       </w:r>
@@ -1903,7 +2415,15 @@
     <w:p>
       <w:r>
         <w:lastRenderedPageBreak/>
-        <w:t>2. **Dashboard Tab Verification — MONETISATION: STAGED MILESTONE PAYMENTS (11 Tabs)**</w:t>
+        <w:t xml:space="preserve">2. **Dashboard Tab Verification — MONETISATION: STAGED MILESTONE PAYMENTS (11 </w:t>
+      </w:r>
+      <w:proofErr w:type="gramStart"/>
+      <w:r>
+        <w:t>Tabs)*</w:t>
+      </w:r>
+      <w:proofErr w:type="gramEnd"/>
+      <w:r>
+        <w:t>*</w:t>
       </w:r>
     </w:p>
     <w:p/>
@@ -2018,7 +2538,15 @@
     <w:p>
       <w:r>
         <w:lastRenderedPageBreak/>
-        <w:t xml:space="preserve">   | Scenario Paths Table | All terminal scenarios with: path description, cumulative probability, expected award, MOIC, IRR |</w:t>
+        <w:t xml:space="preserve">   | Scenario Paths Table | All terminal scenarios </w:t>
+      </w:r>
+      <w:proofErr w:type="gramStart"/>
+      <w:r>
+        <w:t>with:</w:t>
+      </w:r>
+      <w:proofErr w:type="gramEnd"/>
+      <w:r>
+        <w:t xml:space="preserve"> path description, cumulative probability, expected award, MOIC, IRR |</w:t>
       </w:r>
     </w:p>
     <w:p>
@@ -2380,9 +2908,14 @@
       </w:r>
       <w:proofErr w:type="spellStart"/>
       <w:r>
-        <w:t>dashboard_data.json</w:t>
-      </w:r>
-      <w:proofErr w:type="spellEnd"/>
+        <w:t>dashboard_</w:t>
+      </w:r>
+      <w:proofErr w:type="gramStart"/>
+      <w:r>
+        <w:t>data.json</w:t>
+      </w:r>
+      <w:proofErr w:type="spellEnd"/>
+      <w:proofErr w:type="gramEnd"/>
       <w:r>
         <w:t>` dynamically (no hardcoded numbers)</w:t>
       </w:r>
@@ -2440,22 +2973,54 @@
     <w:p/>
     <w:p>
       <w:r>
-        <w:t>**Acceptance Criteria:**</w:t>
-      </w:r>
-    </w:p>
-    <w:p>
-      <w:r>
-        <w:t>- [ ] Staged milestone simulation runs end-to-end without errors (n=1000)</w:t>
-      </w:r>
-    </w:p>
-    <w:p>
-      <w:r>
-        <w:t>- [ ] All 11 dashboard tabs render correctly for staged structure</w:t>
-      </w:r>
-    </w:p>
-    <w:p>
-      <w:r>
-        <w:t xml:space="preserve">- [ ] </w:t>
+        <w:t xml:space="preserve">**Acceptance </w:t>
+      </w:r>
+      <w:proofErr w:type="gramStart"/>
+      <w:r>
+        <w:t>Criteria:*</w:t>
+      </w:r>
+      <w:proofErr w:type="gramEnd"/>
+      <w:r>
+        <w:t>*</w:t>
+      </w:r>
+    </w:p>
+    <w:p>
+      <w:r>
+        <w:t xml:space="preserve">- </w:t>
+      </w:r>
+      <w:proofErr w:type="gramStart"/>
+      <w:r>
+        <w:t>[ ]</w:t>
+      </w:r>
+      <w:proofErr w:type="gramEnd"/>
+      <w:r>
+        <w:t xml:space="preserve"> Staged milestone simulation runs end-to-end without errors (n=1000)</w:t>
+      </w:r>
+    </w:p>
+    <w:p>
+      <w:r>
+        <w:t xml:space="preserve">- </w:t>
+      </w:r>
+      <w:proofErr w:type="gramStart"/>
+      <w:r>
+        <w:t>[ ]</w:t>
+      </w:r>
+      <w:proofErr w:type="gramEnd"/>
+      <w:r>
+        <w:t xml:space="preserve"> All 11 dashboard tabs render correctly for staged structure</w:t>
+      </w:r>
+    </w:p>
+    <w:p>
+      <w:r>
+        <w:t xml:space="preserve">- </w:t>
+      </w:r>
+      <w:proofErr w:type="gramStart"/>
+      <w:r>
+        <w:t>[ ]</w:t>
+      </w:r>
+      <w:proofErr w:type="gramEnd"/>
+      <w:r>
+        <w:t xml:space="preserve"> </w:t>
       </w:r>
       <w:proofErr w:type="spellStart"/>
       <w:r>
@@ -2468,7 +3033,15 @@
     </w:p>
     <w:p>
       <w:r>
-        <w:t xml:space="preserve">- [ ] </w:t>
+        <w:t xml:space="preserve">- </w:t>
+      </w:r>
+      <w:proofErr w:type="gramStart"/>
+      <w:r>
+        <w:t>[ ]</w:t>
+      </w:r>
+      <w:proofErr w:type="gramEnd"/>
+      <w:r>
+        <w:t xml:space="preserve"> </w:t>
       </w:r>
       <w:proofErr w:type="spellStart"/>
       <w:r>
@@ -2481,45 +3054,782 @@
     </w:p>
     <w:p>
       <w:r>
-        <w:t>- [ ] Stochastic Pricing tab shows Monte Carlo distribution and confidence intervals</w:t>
-      </w:r>
-    </w:p>
-    <w:p>
-      <w:r>
-        <w:t>- [ ] Pricing Surface tab renders 3D/heatmap surface correctly</w:t>
-      </w:r>
-    </w:p>
-    <w:p>
-      <w:r>
-        <w:t>- [ ] No hardcoded TATA references in staged-specific components</w:t>
-      </w:r>
-    </w:p>
-    <w:p>
-      <w:r>
-        <w:t>- [ ] Edge cases handled (empty results, extreme values)</w:t>
-      </w:r>
-    </w:p>
-    <w:p>
-      <w:r>
-        <w:t>- [ ] Screenshot evidence of all 11 tabs for QA</w:t>
-      </w:r>
-    </w:p>
-    <w:p/>
-    <w:p/>
-    <w:p/>
-    <w:p/>
-    <w:p/>
-    <w:p/>
-    <w:p/>
-    <w:p/>
-    <w:p/>
-    <w:p/>
-    <w:p/>
-    <w:p/>
-    <w:p/>
-    <w:p/>
-    <w:p/>
-    <w:p/>
+        <w:t xml:space="preserve">- </w:t>
+      </w:r>
+      <w:proofErr w:type="gramStart"/>
+      <w:r>
+        <w:t>[ ]</w:t>
+      </w:r>
+      <w:proofErr w:type="gramEnd"/>
+      <w:r>
+        <w:t xml:space="preserve"> Stochastic Pricing tab shows Monte Carlo distribution and confidence intervals</w:t>
+      </w:r>
+    </w:p>
+    <w:p>
+      <w:r>
+        <w:t xml:space="preserve">- </w:t>
+      </w:r>
+      <w:proofErr w:type="gramStart"/>
+      <w:r>
+        <w:t>[ ]</w:t>
+      </w:r>
+      <w:proofErr w:type="gramEnd"/>
+      <w:r>
+        <w:t xml:space="preserve"> Pricing Surface tab renders 3D/heatmap surface correctly</w:t>
+      </w:r>
+    </w:p>
+    <w:p>
+      <w:r>
+        <w:t xml:space="preserve">- </w:t>
+      </w:r>
+      <w:proofErr w:type="gramStart"/>
+      <w:r>
+        <w:t>[ ]</w:t>
+      </w:r>
+      <w:proofErr w:type="gramEnd"/>
+      <w:r>
+        <w:t xml:space="preserve"> No hardcoded TATA references in staged-specific components</w:t>
+      </w:r>
+    </w:p>
+    <w:p>
+      <w:r>
+        <w:t xml:space="preserve">- </w:t>
+      </w:r>
+      <w:proofErr w:type="gramStart"/>
+      <w:r>
+        <w:t>[ ]</w:t>
+      </w:r>
+      <w:proofErr w:type="gramEnd"/>
+      <w:r>
+        <w:t xml:space="preserve"> Edge cases handled (empty results, extreme values)</w:t>
+      </w:r>
+    </w:p>
+    <w:p>
+      <w:r>
+        <w:t xml:space="preserve">- </w:t>
+      </w:r>
+      <w:proofErr w:type="gramStart"/>
+      <w:r>
+        <w:t>[ ]</w:t>
+      </w:r>
+      <w:proofErr w:type="gramEnd"/>
+      <w:r>
+        <w:t xml:space="preserve"> Screenshot evidence of all 11 tabs for QA</w:t>
+      </w:r>
+    </w:p>
+    <w:p/>
+    <w:p/>
+    <w:p/>
+    <w:p>
+      <w:r>
+        <w:t>rm -rf /root/claim-analytics-platform</w:t>
+      </w:r>
+    </w:p>
+    <w:p>
+      <w:r>
+        <w:t>cd /root</w:t>
+      </w:r>
+    </w:p>
+    <w:p>
+      <w:r>
+        <w:t>git clone https://github.com/itsnilay87/claim-analytics-platform.git</w:t>
+      </w:r>
+    </w:p>
+    <w:p>
+      <w:r>
+        <w:t>cd claim-analytics-platform</w:t>
+      </w:r>
+    </w:p>
+    <w:p>
+      <w:r>
+        <w:t>git log --</w:t>
+      </w:r>
+      <w:proofErr w:type="spellStart"/>
+      <w:r>
+        <w:t>oneline</w:t>
+      </w:r>
+      <w:proofErr w:type="spellEnd"/>
+      <w:r>
+        <w:t xml:space="preserve"> -5</w:t>
+      </w:r>
+    </w:p>
+    <w:p/>
+    <w:p/>
+    <w:p/>
+    <w:p/>
+    <w:p/>
+    <w:p/>
+    <w:p/>
+    <w:p/>
+    <w:p/>
+    <w:p/>
+    <w:p/>
+    <w:p>
+      <w:r>
+        <w:t>CHECK IF WE HAVE COMPLETED THE EVERYTHING IN THE FOLLOWING TICKET AND GIVE ME COMMENTS TO ADD IN EACH TICKET TO RECORD PROGRESS, IF WE HAVE COMPLTED EVERYTHING HTE M GIVE ME CLOSING NTOES THAT CAN BE ADDED IN COMMENTS</w:t>
+      </w:r>
+    </w:p>
+    <w:p>
+      <w:r>
+        <w:t>## CAP-020 Progress Update — 27 Mar 2026</w:t>
+      </w:r>
+    </w:p>
+    <w:p/>
+    <w:p>
+      <w:r>
+        <w:t xml:space="preserve">### Status: </w:t>
+      </w:r>
+      <w:r>
+        <w:rPr>
+          <w:rFonts w:ascii="Segoe UI Emoji" w:hAnsi="Segoe UI Emoji" w:cs="Segoe UI Emoji"/>
+        </w:rPr>
+        <w:t>🟡</w:t>
+      </w:r>
+      <w:r>
+        <w:t xml:space="preserve"> ~85% COMPLETE — Security gaps need resolution before closing</w:t>
+      </w:r>
+    </w:p>
+    <w:p/>
+    <w:p>
+      <w:r>
+        <w:t xml:space="preserve">**Completed </w:t>
+      </w:r>
+      <w:proofErr w:type="gramStart"/>
+      <w:r>
+        <w:t>Requirements:*</w:t>
+      </w:r>
+      <w:proofErr w:type="gramEnd"/>
+      <w:r>
+        <w:t>*</w:t>
+      </w:r>
+    </w:p>
+    <w:p/>
+    <w:p>
+      <w:r>
+        <w:t xml:space="preserve">1. **Database-Level Isolation — </w:t>
+      </w:r>
+      <w:r>
+        <w:rPr>
+          <w:rFonts w:ascii="Segoe UI Emoji" w:hAnsi="Segoe UI Emoji" w:cs="Segoe UI Emoji"/>
+        </w:rPr>
+        <w:t>✅</w:t>
+      </w:r>
+      <w:r>
+        <w:t xml:space="preserve"> DONE**</w:t>
+      </w:r>
+    </w:p>
+    <w:p>
+      <w:r>
+        <w:t xml:space="preserve">   - Claim.js: All queries (</w:t>
+      </w:r>
+      <w:proofErr w:type="spellStart"/>
+      <w:r>
+        <w:t>findAllByWorkspace</w:t>
+      </w:r>
+      <w:proofErr w:type="spellEnd"/>
+      <w:r>
+        <w:t xml:space="preserve">, </w:t>
+      </w:r>
+      <w:proofErr w:type="spellStart"/>
+      <w:r>
+        <w:t>findById</w:t>
+      </w:r>
+      <w:proofErr w:type="spellEnd"/>
+      <w:r>
+        <w:t xml:space="preserve">, update, delete, </w:t>
+      </w:r>
+      <w:proofErr w:type="spellStart"/>
+      <w:r>
+        <w:t>updateStatus</w:t>
+      </w:r>
+      <w:proofErr w:type="spellEnd"/>
+      <w:r>
+        <w:t xml:space="preserve">) include WHERE </w:t>
+      </w:r>
+      <w:proofErr w:type="spellStart"/>
+      <w:r>
+        <w:t>user_id</w:t>
+      </w:r>
+      <w:proofErr w:type="spellEnd"/>
+      <w:r>
+        <w:t xml:space="preserve"> = req.user.id</w:t>
+      </w:r>
+    </w:p>
+    <w:p>
+      <w:r>
+        <w:t xml:space="preserve">   - Portfolio.js: All queries scoped by </w:t>
+      </w:r>
+      <w:proofErr w:type="spellStart"/>
+      <w:r>
+        <w:t>user_id</w:t>
+      </w:r>
+      <w:proofErr w:type="spellEnd"/>
+      <w:r>
+        <w:t xml:space="preserve">, including </w:t>
+      </w:r>
+      <w:proofErr w:type="spellStart"/>
+      <w:r>
+        <w:t>updateRunId</w:t>
+      </w:r>
+      <w:proofErr w:type="spellEnd"/>
+      <w:r>
+        <w:t xml:space="preserve">, </w:t>
+      </w:r>
+      <w:proofErr w:type="spellStart"/>
+      <w:r>
+        <w:t>updateStatus</w:t>
+      </w:r>
+      <w:proofErr w:type="spellEnd"/>
+    </w:p>
+    <w:p>
+      <w:r>
+        <w:t xml:space="preserve">   - SimulationRun.js: All user-facing queries scoped. </w:t>
+      </w:r>
+      <w:proofErr w:type="spellStart"/>
+      <w:r>
+        <w:t>updateStatus</w:t>
+      </w:r>
+      <w:proofErr w:type="spellEnd"/>
+      <w:r>
+        <w:t xml:space="preserve"> omits </w:t>
+      </w:r>
+      <w:proofErr w:type="spellStart"/>
+      <w:r>
+        <w:t>user_id</w:t>
+      </w:r>
+      <w:proofErr w:type="spellEnd"/>
+      <w:r>
+        <w:t xml:space="preserve"> (server-internal only, not route-exposed)</w:t>
+      </w:r>
+    </w:p>
+    <w:p>
+      <w:r>
+        <w:t xml:space="preserve">   - Workspace.js: All CRUD operations include </w:t>
+      </w:r>
+      <w:proofErr w:type="spellStart"/>
+      <w:r>
+        <w:t>user_id</w:t>
+      </w:r>
+      <w:proofErr w:type="spellEnd"/>
+      <w:r>
+        <w:t xml:space="preserve"> scoping</w:t>
+      </w:r>
+    </w:p>
+    <w:p>
+      <w:r>
+        <w:t xml:space="preserve">   - Foreign key constraints: All tables have `</w:t>
+      </w:r>
+      <w:proofErr w:type="spellStart"/>
+      <w:r>
+        <w:t>user_id</w:t>
+      </w:r>
+      <w:proofErr w:type="spellEnd"/>
+      <w:r>
+        <w:t xml:space="preserve"> REFERENCES users(id) ON DELETE CASCADE`</w:t>
+      </w:r>
+    </w:p>
+    <w:p>
+      <w:r>
+        <w:t xml:space="preserve">   - Cascade deletes configured: deleting a user removes all their data</w:t>
+      </w:r>
+    </w:p>
+    <w:p/>
+    <w:p>
+      <w:r>
+        <w:t xml:space="preserve">2. **API Isolation — </w:t>
+      </w:r>
+      <w:r>
+        <w:rPr>
+          <w:rFonts w:ascii="Segoe UI Emoji" w:hAnsi="Segoe UI Emoji" w:cs="Segoe UI Emoji"/>
+        </w:rPr>
+        <w:t>✅</w:t>
+      </w:r>
+      <w:r>
+        <w:t xml:space="preserve"> MOSTLY DONE**</w:t>
+      </w:r>
+    </w:p>
+    <w:p>
+      <w:r>
+        <w:t xml:space="preserve">   - Claims routes: All 6 endpoints fully scoped (GET list/detail, POST, PUT, DELETE, status update)</w:t>
+      </w:r>
+    </w:p>
+    <w:p>
+      <w:r>
+        <w:t xml:space="preserve">   - Portfolios routes: All 7 endpoints fully scoped (CRUD + claims + structure)</w:t>
+      </w:r>
+    </w:p>
+    <w:p>
+      <w:r>
+        <w:t xml:space="preserve">   - Runs routes: All endpoints fully scoped (list, detail, compare, delete, save, discard)</w:t>
+      </w:r>
+    </w:p>
+    <w:p>
+      <w:r>
+        <w:lastRenderedPageBreak/>
+        <w:t xml:space="preserve">   - Workspaces routes: All CRUD fully scoped</w:t>
+      </w:r>
+    </w:p>
+    <w:p>
+      <w:r>
+        <w:t xml:space="preserve">   - Simulate routes (new): POST /</w:t>
+      </w:r>
+      <w:proofErr w:type="spellStart"/>
+      <w:r>
+        <w:t>api</w:t>
+      </w:r>
+      <w:proofErr w:type="spellEnd"/>
+      <w:r>
+        <w:t>/simulate/claim and /</w:t>
+      </w:r>
+      <w:proofErr w:type="spellStart"/>
+      <w:r>
+        <w:t>api</w:t>
+      </w:r>
+      <w:proofErr w:type="spellEnd"/>
+      <w:r>
+        <w:t>/simulate/portfolio — authenticated, DB-recorded</w:t>
+      </w:r>
+    </w:p>
+    <w:p/>
+    <w:p>
+      <w:r>
+        <w:t xml:space="preserve">3. **Frontend Isolation — </w:t>
+      </w:r>
+      <w:r>
+        <w:rPr>
+          <w:rFonts w:ascii="Segoe UI Emoji" w:hAnsi="Segoe UI Emoji" w:cs="Segoe UI Emoji"/>
+        </w:rPr>
+        <w:t>✅</w:t>
+      </w:r>
+      <w:r>
+        <w:t xml:space="preserve"> DONE**</w:t>
+      </w:r>
+    </w:p>
+    <w:p>
+      <w:r>
+        <w:t xml:space="preserve">   - </w:t>
+      </w:r>
+      <w:proofErr w:type="spellStart"/>
+      <w:r>
+        <w:t>authStore.logout</w:t>
+      </w:r>
+      <w:proofErr w:type="spellEnd"/>
+      <w:r>
+        <w:t xml:space="preserve">() clears workspace, claim, and portfolio stores via </w:t>
+      </w:r>
+      <w:proofErr w:type="gramStart"/>
+      <w:r>
+        <w:t>reset(</w:t>
+      </w:r>
+      <w:proofErr w:type="gramEnd"/>
+      <w:r>
+        <w:t>)</w:t>
+      </w:r>
+    </w:p>
+    <w:p>
+      <w:r>
+        <w:t xml:space="preserve">   - Access token stored in memory (module variable), NOT </w:t>
+      </w:r>
+      <w:proofErr w:type="spellStart"/>
+      <w:r>
+        <w:t>localStorage</w:t>
+      </w:r>
+      <w:proofErr w:type="spellEnd"/>
+    </w:p>
+    <w:p>
+      <w:r>
+        <w:t xml:space="preserve">   - Refresh token as </w:t>
+      </w:r>
+      <w:proofErr w:type="spellStart"/>
+      <w:r>
+        <w:t>HttpOnly</w:t>
+      </w:r>
+      <w:proofErr w:type="spellEnd"/>
+      <w:r>
+        <w:t xml:space="preserve"> cookie</w:t>
+      </w:r>
+    </w:p>
+    <w:p>
+      <w:r>
+        <w:t xml:space="preserve">   - Auto-refresh on 401 with retry queue</w:t>
+      </w:r>
+    </w:p>
+    <w:p>
+      <w:r>
+        <w:t xml:space="preserve">   - Login loads only authenticated user's data via scoped API calls</w:t>
+      </w:r>
+    </w:p>
+    <w:p/>
+    <w:p>
+      <w:r>
+        <w:t>**Remaining Gaps (should be addressed before closing</w:t>
+      </w:r>
+      <w:proofErr w:type="gramStart"/>
+      <w:r>
+        <w:t>):*</w:t>
+      </w:r>
+      <w:proofErr w:type="gramEnd"/>
+      <w:r>
+        <w:t>*</w:t>
+      </w:r>
+    </w:p>
+    <w:p/>
+    <w:p>
+      <w:r>
+        <w:t xml:space="preserve">4. **File System Isolation — </w:t>
+      </w:r>
+      <w:r>
+        <w:rPr>
+          <w:rFonts w:ascii="Segoe UI Emoji" w:hAnsi="Segoe UI Emoji" w:cs="Segoe UI Emoji"/>
+        </w:rPr>
+        <w:t>❌</w:t>
+      </w:r>
+      <w:r>
+        <w:t xml:space="preserve"> NOT DONE**</w:t>
+      </w:r>
+    </w:p>
+    <w:p>
+      <w:r>
+        <w:t xml:space="preserve">   - Current: server/runs/{</w:t>
+      </w:r>
+      <w:proofErr w:type="spellStart"/>
+      <w:r>
+        <w:t>runId</w:t>
+      </w:r>
+      <w:proofErr w:type="spellEnd"/>
+      <w:r>
+        <w:t>}/outputs/</w:t>
+      </w:r>
+    </w:p>
+    <w:p>
+      <w:r>
+        <w:t xml:space="preserve">   - Required: server/runs/{</w:t>
+      </w:r>
+      <w:proofErr w:type="spellStart"/>
+      <w:r>
+        <w:t>userId</w:t>
+      </w:r>
+      <w:proofErr w:type="spellEnd"/>
+      <w:r>
+        <w:t>}/{</w:t>
+      </w:r>
+      <w:proofErr w:type="spellStart"/>
+      <w:r>
+        <w:t>runId</w:t>
+      </w:r>
+      <w:proofErr w:type="spellEnd"/>
+      <w:r>
+        <w:t>}/outputs/</w:t>
+      </w:r>
+    </w:p>
+    <w:p>
+      <w:r>
+        <w:t xml:space="preserve">   - Impact: Low (DB ownership check prevents unauthorized API access when authenticated)</w:t>
+      </w:r>
+    </w:p>
+    <w:p>
+      <w:r>
+        <w:t xml:space="preserve">   - Files affected: simulationRunner.js (run output path), results.js (file serving)</w:t>
+      </w:r>
+    </w:p>
+    <w:p>
+      <w:r>
+        <w:t xml:space="preserve">   - Migration needed for existing runs</w:t>
+      </w:r>
+    </w:p>
+    <w:p/>
+    <w:p>
+      <w:r>
+        <w:t xml:space="preserve">5. **Results Routes IDOR Risk — </w:t>
+      </w:r>
+      <w:r>
+        <w:rPr>
+          <w:rFonts w:ascii="Segoe UI Emoji" w:hAnsi="Segoe UI Emoji" w:cs="Segoe UI Emoji"/>
+        </w:rPr>
+        <w:t>⚠️</w:t>
+      </w:r>
+      <w:r>
+        <w:t xml:space="preserve"> SECURITY GAP**</w:t>
+      </w:r>
+    </w:p>
+    <w:p>
+      <w:r>
+        <w:t xml:space="preserve">   - results.js uses </w:t>
+      </w:r>
+      <w:proofErr w:type="spellStart"/>
+      <w:r>
+        <w:t>optionalAuth</w:t>
+      </w:r>
+      <w:proofErr w:type="spellEnd"/>
+      <w:r>
+        <w:t xml:space="preserve"> — unauthenticated requests bypass ownership check</w:t>
+      </w:r>
+    </w:p>
+    <w:p>
+      <w:r>
+        <w:t xml:space="preserve">   - </w:t>
+      </w:r>
+      <w:proofErr w:type="spellStart"/>
+      <w:proofErr w:type="gramStart"/>
+      <w:r>
+        <w:t>verifyRunOwnership</w:t>
+      </w:r>
+      <w:proofErr w:type="spellEnd"/>
+      <w:r>
+        <w:t>(</w:t>
+      </w:r>
+      <w:proofErr w:type="gramEnd"/>
+      <w:r>
+        <w:t xml:space="preserve">) returns true when </w:t>
+      </w:r>
+      <w:proofErr w:type="spellStart"/>
+      <w:r>
+        <w:t>req.user</w:t>
+      </w:r>
+      <w:proofErr w:type="spellEnd"/>
+      <w:r>
+        <w:t xml:space="preserve"> is null</w:t>
+      </w:r>
+    </w:p>
+    <w:p>
+      <w:r>
+        <w:t xml:space="preserve">   - </w:t>
+      </w:r>
+      <w:proofErr w:type="spellStart"/>
+      <w:proofErr w:type="gramStart"/>
+      <w:r>
+        <w:t>verifyRunOwnership</w:t>
+      </w:r>
+      <w:proofErr w:type="spellEnd"/>
+      <w:r>
+        <w:t>(</w:t>
+      </w:r>
+      <w:proofErr w:type="gramEnd"/>
+      <w:r>
+        <w:t>) returns true when DB query fails (fail-open)</w:t>
+      </w:r>
+    </w:p>
+    <w:p>
+      <w:r>
+        <w:t xml:space="preserve">   - Impact: Anyone with a run UUID can access </w:t>
+      </w:r>
+      <w:proofErr w:type="spellStart"/>
+      <w:r>
+        <w:t>dashboard_</w:t>
+      </w:r>
+      <w:proofErr w:type="gramStart"/>
+      <w:r>
+        <w:t>data.json</w:t>
+      </w:r>
+      <w:proofErr w:type="spellEnd"/>
+      <w:proofErr w:type="gramEnd"/>
+      <w:r>
+        <w:t>, charts, Excel/PDF exports</w:t>
+      </w:r>
+    </w:p>
+    <w:p>
+      <w:r>
+        <w:t xml:space="preserve">   - Fix: Change </w:t>
+      </w:r>
+      <w:proofErr w:type="spellStart"/>
+      <w:r>
+        <w:t>optionalAuth</w:t>
+      </w:r>
+      <w:proofErr w:type="spellEnd"/>
+      <w:r>
+        <w:t xml:space="preserve"> to </w:t>
+      </w:r>
+      <w:proofErr w:type="spellStart"/>
+      <w:r>
+        <w:t>authenticateToken</w:t>
+      </w:r>
+      <w:proofErr w:type="spellEnd"/>
+      <w:r>
+        <w:t xml:space="preserve"> on results routes, or add stricter ownership check for unauthenticated access</w:t>
+      </w:r>
+    </w:p>
+    <w:p/>
+    <w:p>
+      <w:r>
+        <w:t xml:space="preserve">6. **Legacy Simulate Endpoint — </w:t>
+      </w:r>
+      <w:r>
+        <w:rPr>
+          <w:rFonts w:ascii="Segoe UI Emoji" w:hAnsi="Segoe UI Emoji" w:cs="Segoe UI Emoji"/>
+        </w:rPr>
+        <w:t>⚠️</w:t>
+      </w:r>
+      <w:r>
+        <w:t xml:space="preserve"> NO AUTH**</w:t>
+      </w:r>
+    </w:p>
+    <w:p>
+      <w:r>
+        <w:t xml:space="preserve">   - POST /</w:t>
+      </w:r>
+      <w:proofErr w:type="spellStart"/>
+      <w:r>
+        <w:t>api</w:t>
+      </w:r>
+      <w:proofErr w:type="spellEnd"/>
+      <w:r>
+        <w:t xml:space="preserve">/simulate (legacy) has no </w:t>
+      </w:r>
+      <w:proofErr w:type="spellStart"/>
+      <w:r>
+        <w:t>authenticateToken</w:t>
+      </w:r>
+      <w:proofErr w:type="spellEnd"/>
+      <w:r>
+        <w:t xml:space="preserve"> middleware</w:t>
+      </w:r>
+    </w:p>
+    <w:p>
+      <w:r>
+        <w:t xml:space="preserve">   - No DB record created, no user association</w:t>
+      </w:r>
+    </w:p>
+    <w:p>
+      <w:r>
+        <w:t xml:space="preserve">   - Fix: Add auth or deprecate/remove the legacy endpoint</w:t>
+      </w:r>
+    </w:p>
+    <w:p/>
+    <w:p>
+      <w:r>
+        <w:t>**</w:t>
+      </w:r>
+      <w:proofErr w:type="gramStart"/>
+      <w:r>
+        <w:t>Recommendation:*</w:t>
+      </w:r>
+      <w:proofErr w:type="gramEnd"/>
+      <w:r>
+        <w:t xml:space="preserve">* Do NOT close yet. Items 5 and 6 are security issues that should be resolved first. Item 4 (file system </w:t>
+      </w:r>
+      <w:proofErr w:type="spellStart"/>
+      <w:r>
+        <w:t>namespacing</w:t>
+      </w:r>
+      <w:proofErr w:type="spellEnd"/>
+      <w:r>
+        <w:t>) is lower priority but still a requirement per ticket spec.</w:t>
+      </w:r>
+    </w:p>
+    <w:p/>
+    <w:p>
+      <w:r>
+        <w:t xml:space="preserve">**Suggested follow-up </w:t>
+      </w:r>
+      <w:proofErr w:type="gramStart"/>
+      <w:r>
+        <w:t>work:*</w:t>
+      </w:r>
+      <w:proofErr w:type="gramEnd"/>
+      <w:r>
+        <w:t>*</w:t>
+      </w:r>
+    </w:p>
+    <w:p>
+      <w:r>
+        <w:t xml:space="preserve">- </w:t>
+      </w:r>
+      <w:proofErr w:type="gramStart"/>
+      <w:r>
+        <w:t>[ ]</w:t>
+      </w:r>
+      <w:proofErr w:type="gramEnd"/>
+      <w:r>
+        <w:t xml:space="preserve"> Move results routes from </w:t>
+      </w:r>
+      <w:proofErr w:type="spellStart"/>
+      <w:r>
+        <w:t>optionalAuth</w:t>
+      </w:r>
+      <w:proofErr w:type="spellEnd"/>
+      <w:r>
+        <w:t xml:space="preserve"> to </w:t>
+      </w:r>
+      <w:proofErr w:type="spellStart"/>
+      <w:r>
+        <w:t>authenticateToken</w:t>
+      </w:r>
+      <w:proofErr w:type="spellEnd"/>
+      <w:r>
+        <w:t xml:space="preserve"> (breaking change for legacy dashboard)</w:t>
+      </w:r>
+    </w:p>
+    <w:p>
+      <w:r>
+        <w:t xml:space="preserve">- </w:t>
+      </w:r>
+      <w:proofErr w:type="gramStart"/>
+      <w:r>
+        <w:t>[ ]</w:t>
+      </w:r>
+      <w:proofErr w:type="gramEnd"/>
+      <w:r>
+        <w:t xml:space="preserve"> Make </w:t>
+      </w:r>
+      <w:proofErr w:type="spellStart"/>
+      <w:r>
+        <w:t>verifyRunOwnership</w:t>
+      </w:r>
+      <w:proofErr w:type="spellEnd"/>
+      <w:r>
+        <w:t xml:space="preserve"> fail-closed on DB errors</w:t>
+      </w:r>
+    </w:p>
+    <w:p>
+      <w:r>
+        <w:t xml:space="preserve">- </w:t>
+      </w:r>
+      <w:proofErr w:type="gramStart"/>
+      <w:r>
+        <w:t>[ ]</w:t>
+      </w:r>
+      <w:proofErr w:type="gramEnd"/>
+      <w:r>
+        <w:t xml:space="preserve"> Add </w:t>
+      </w:r>
+      <w:proofErr w:type="spellStart"/>
+      <w:r>
+        <w:t>authenticateToken</w:t>
+      </w:r>
+      <w:proofErr w:type="spellEnd"/>
+      <w:r>
+        <w:t xml:space="preserve"> to legacy POST /</w:t>
+      </w:r>
+      <w:proofErr w:type="spellStart"/>
+      <w:r>
+        <w:t>api</w:t>
+      </w:r>
+      <w:proofErr w:type="spellEnd"/>
+      <w:r>
+        <w:t>/simulate or remove it</w:t>
+      </w:r>
+    </w:p>
+    <w:p>
+      <w:r>
+        <w:t xml:space="preserve">- </w:t>
+      </w:r>
+      <w:proofErr w:type="gramStart"/>
+      <w:r>
+        <w:t>[ ]</w:t>
+      </w:r>
+      <w:proofErr w:type="gramEnd"/>
+      <w:r>
+        <w:t xml:space="preserve"> Namespace file storage under </w:t>
+      </w:r>
+      <w:proofErr w:type="spellStart"/>
+      <w:r>
+        <w:t>userId</w:t>
+      </w:r>
+      <w:proofErr w:type="spellEnd"/>
+      <w:r>
+        <w:t xml:space="preserve"> (migration script for existing runs)</w:t>
+      </w:r>
+    </w:p>
     <w:sectPr>
       <w:pgSz w:w="11906" w:h="16838"/>
       <w:pgMar w:top="1440" w:right="1440" w:bottom="1440" w:left="1440" w:header="708" w:footer="708" w:gutter="0"/>

</xml_diff>